<commit_message>
Fix report: Qwen training config, error analysis numbers, Mode 3 limitations
</commit_message>
<xml_diff>
--- a/Nhom02_NLP_BAOCAO.docx
+++ b/Nhom02_NLP_BAOCAO.docx
@@ -6134,7 +6134,7 @@
             <w:noProof/>
             <w:webHidden/>
           </w:rPr>
-          <w:t>48</w:t>
+          <w:t>4</w:t>
         </w:r>
         <w:r>
           <w:rPr>
@@ -6144,6 +6144,9 @@
           <w:fldChar w:fldCharType="end"/>
         </w:r>
       </w:hyperlink>
+      <w:r>
+        <w:t>8</w:t>
+      </w:r>
     </w:p>
     <w:p>
       <w:pPr>
@@ -6530,6 +6533,9 @@
       <w:pPr>
         <w:pStyle w:val="u1"/>
         <w:ind w:firstLine="0"/>
+        <w:rPr>
+          <w:noProof/>
+        </w:rPr>
       </w:pPr>
       <w:bookmarkStart w:id="5" w:name="_Toc225719233"/>
       <w:bookmarkStart w:id="6" w:name="_Toc225433766"/>
@@ -7259,6 +7265,1784 @@
           <w:tab w:val="right" w:leader="dot" w:pos="8999"/>
         </w:tabs>
         <w:spacing w:line="360" w:lineRule="auto"/>
+        <w:jc w:val="left"/>
+        <w:rPr>
+          <w:rFonts w:asciiTheme="minorHAnsi" w:eastAsiaTheme="minorEastAsia" w:hAnsiTheme="minorHAnsi"/>
+          <w:noProof/>
+          <w:kern w:val="2"/>
+          <w:sz w:val="24"/>
+          <w:szCs w:val="24"/>
+          <w:lang w:val="vi-VN" w:eastAsia="zh-CN"/>
+          <w14:ligatures w14:val="standardContextual"/>
+        </w:rPr>
+      </w:pPr>
+      <w:r>
+        <w:fldChar w:fldCharType="begin"/>
+      </w:r>
+      <w:r>
+        <w:instrText xml:space="preserve"> TOC \h \z \t "Hình,1" \c </w:instrText>
+      </w:r>
+      <w:r>
+        <w:fldChar w:fldCharType="separate"/>
+      </w:r>
+      <w:hyperlink w:anchor="_Toc242025705" w:history="1">
+        <w:r>
+          <w:rPr>
+            <w:rStyle w:val="Siuktni"/>
+            <w:noProof/>
+            <w:lang w:val="vi-VN" w:eastAsia="vi-VN"/>
+          </w:rPr>
+          <w:t>Hình 2.1: Pipeline tiền xử lý văn bản tiếng Việt</w:t>
+        </w:r>
+        <w:r>
+          <w:rPr>
+            <w:noProof/>
+            <w:webHidden/>
+          </w:rPr>
+          <w:tab/>
+        </w:r>
+        <w:r>
+          <w:rPr>
+            <w:noProof/>
+            <w:webHidden/>
+          </w:rPr>
+          <w:fldChar w:fldCharType="begin"/>
+        </w:r>
+        <w:r>
+          <w:rPr>
+            <w:noProof/>
+            <w:webHidden/>
+          </w:rPr>
+          <w:instrText xml:space="preserve"> PAGEREF _Toc242025705 \h </w:instrText>
+        </w:r>
+        <w:r>
+          <w:rPr>
+            <w:noProof/>
+            <w:webHidden/>
+          </w:rPr>
+        </w:r>
+        <w:r>
+          <w:rPr>
+            <w:noProof/>
+            <w:webHidden/>
+          </w:rPr>
+          <w:fldChar w:fldCharType="separate"/>
+        </w:r>
+        <w:r>
+          <w:rPr>
+            <w:noProof/>
+            <w:webHidden/>
+          </w:rPr>
+          <w:t>14</w:t>
+        </w:r>
+        <w:r>
+          <w:rPr>
+            <w:noProof/>
+            <w:webHidden/>
+          </w:rPr>
+          <w:fldChar w:fldCharType="end"/>
+        </w:r>
+      </w:hyperlink>
+    </w:p>
+    <w:p>
+      <w:pPr>
+        <w:pStyle w:val="Banghinhminhhoa"/>
+        <w:tabs>
+          <w:tab w:val="right" w:leader="dot" w:pos="8999"/>
+        </w:tabs>
+        <w:spacing w:line="360" w:lineRule="auto"/>
+        <w:jc w:val="left"/>
+        <w:rPr>
+          <w:rFonts w:asciiTheme="minorHAnsi" w:eastAsiaTheme="minorEastAsia" w:hAnsiTheme="minorHAnsi"/>
+          <w:noProof/>
+          <w:kern w:val="2"/>
+          <w:sz w:val="24"/>
+          <w:szCs w:val="24"/>
+          <w:lang w:val="vi-VN" w:eastAsia="zh-CN"/>
+          <w14:ligatures w14:val="standardContextual"/>
+        </w:rPr>
+      </w:pPr>
+      <w:hyperlink w:anchor="_Toc242025706" w:history="1">
+        <w:r>
+          <w:rPr>
+            <w:rStyle w:val="Siuktni"/>
+            <w:noProof/>
+            <w:lang w:val="vi-VN"/>
+          </w:rPr>
+          <w:t>Hình 3.1: Code minh họa - Xây dựng và đánh giá TF-IDF Baseline</w:t>
+        </w:r>
+        <w:r>
+          <w:rPr>
+            <w:noProof/>
+            <w:webHidden/>
+          </w:rPr>
+          <w:tab/>
+        </w:r>
+        <w:r>
+          <w:rPr>
+            <w:noProof/>
+            <w:webHidden/>
+          </w:rPr>
+          <w:fldChar w:fldCharType="begin"/>
+        </w:r>
+        <w:r>
+          <w:rPr>
+            <w:noProof/>
+            <w:webHidden/>
+          </w:rPr>
+          <w:instrText xml:space="preserve"> PAGEREF _Toc242025706 \h </w:instrText>
+        </w:r>
+        <w:r>
+          <w:rPr>
+            <w:noProof/>
+            <w:webHidden/>
+          </w:rPr>
+        </w:r>
+        <w:r>
+          <w:rPr>
+            <w:noProof/>
+            <w:webHidden/>
+          </w:rPr>
+          <w:fldChar w:fldCharType="separate"/>
+        </w:r>
+        <w:r>
+          <w:rPr>
+            <w:noProof/>
+            <w:webHidden/>
+          </w:rPr>
+          <w:t>19</w:t>
+        </w:r>
+        <w:r>
+          <w:rPr>
+            <w:noProof/>
+            <w:webHidden/>
+          </w:rPr>
+          <w:fldChar w:fldCharType="end"/>
+        </w:r>
+      </w:hyperlink>
+    </w:p>
+    <w:p>
+      <w:pPr>
+        <w:pStyle w:val="Banghinhminhhoa"/>
+        <w:tabs>
+          <w:tab w:val="right" w:leader="dot" w:pos="8999"/>
+        </w:tabs>
+        <w:spacing w:line="360" w:lineRule="auto"/>
+        <w:jc w:val="left"/>
+        <w:rPr>
+          <w:rFonts w:asciiTheme="minorHAnsi" w:eastAsiaTheme="minorEastAsia" w:hAnsiTheme="minorHAnsi"/>
+          <w:noProof/>
+          <w:kern w:val="2"/>
+          <w:sz w:val="24"/>
+          <w:szCs w:val="24"/>
+          <w:lang w:val="vi-VN" w:eastAsia="zh-CN"/>
+          <w14:ligatures w14:val="standardContextual"/>
+        </w:rPr>
+      </w:pPr>
+      <w:hyperlink w:anchor="_Toc242025707" w:history="1">
+        <w:r>
+          <w:rPr>
+            <w:rStyle w:val="Siuktni"/>
+            <w:noProof/>
+            <w:lang w:val="vi-VN"/>
+          </w:rPr>
+          <w:t>Hình 3.2: Code minh họa - Hàm llm_generate_answer() (RAG với Ollama API)</w:t>
+        </w:r>
+        <w:r>
+          <w:rPr>
+            <w:noProof/>
+            <w:webHidden/>
+          </w:rPr>
+          <w:tab/>
+        </w:r>
+        <w:r>
+          <w:rPr>
+            <w:noProof/>
+            <w:webHidden/>
+          </w:rPr>
+          <w:fldChar w:fldCharType="begin"/>
+        </w:r>
+        <w:r>
+          <w:rPr>
+            <w:noProof/>
+            <w:webHidden/>
+          </w:rPr>
+          <w:instrText xml:space="preserve"> PAGEREF _Toc242025707 \h </w:instrText>
+        </w:r>
+        <w:r>
+          <w:rPr>
+            <w:noProof/>
+            <w:webHidden/>
+          </w:rPr>
+        </w:r>
+        <w:r>
+          <w:rPr>
+            <w:noProof/>
+            <w:webHidden/>
+          </w:rPr>
+          <w:fldChar w:fldCharType="separate"/>
+        </w:r>
+        <w:r>
+          <w:rPr>
+            <w:noProof/>
+            <w:webHidden/>
+          </w:rPr>
+          <w:t>20</w:t>
+        </w:r>
+        <w:r>
+          <w:rPr>
+            <w:noProof/>
+            <w:webHidden/>
+          </w:rPr>
+          <w:fldChar w:fldCharType="end"/>
+        </w:r>
+      </w:hyperlink>
+    </w:p>
+    <w:p>
+      <w:pPr>
+        <w:pStyle w:val="Banghinhminhhoa"/>
+        <w:tabs>
+          <w:tab w:val="right" w:leader="dot" w:pos="8999"/>
+        </w:tabs>
+        <w:spacing w:line="360" w:lineRule="auto"/>
+        <w:jc w:val="left"/>
+        <w:rPr>
+          <w:rFonts w:asciiTheme="minorHAnsi" w:eastAsiaTheme="minorEastAsia" w:hAnsiTheme="minorHAnsi"/>
+          <w:noProof/>
+          <w:kern w:val="2"/>
+          <w:sz w:val="24"/>
+          <w:szCs w:val="24"/>
+          <w:lang w:val="vi-VN" w:eastAsia="zh-CN"/>
+          <w14:ligatures w14:val="standardContextual"/>
+        </w:rPr>
+      </w:pPr>
+      <w:hyperlink w:anchor="_Toc242025708" w:history="1">
+        <w:r>
+          <w:rPr>
+            <w:rStyle w:val="Siuktni"/>
+            <w:noProof/>
+            <w:lang w:val="vi-VN" w:eastAsia="vi-VN"/>
+          </w:rPr>
+          <w:t>Hình 3.3: Kiến trúc tổng quan hệ thống Hybrid FAQ + Generative RAG (ngưỡng THRESHOLD trong cài đặt thực tế là 0.6)</w:t>
+        </w:r>
+        <w:r>
+          <w:rPr>
+            <w:noProof/>
+            <w:webHidden/>
+          </w:rPr>
+          <w:tab/>
+        </w:r>
+        <w:r>
+          <w:rPr>
+            <w:noProof/>
+            <w:webHidden/>
+          </w:rPr>
+          <w:fldChar w:fldCharType="begin"/>
+        </w:r>
+        <w:r>
+          <w:rPr>
+            <w:noProof/>
+            <w:webHidden/>
+          </w:rPr>
+          <w:instrText xml:space="preserve"> PAGEREF _Toc242025708 \h </w:instrText>
+        </w:r>
+        <w:r>
+          <w:rPr>
+            <w:noProof/>
+            <w:webHidden/>
+          </w:rPr>
+        </w:r>
+        <w:r>
+          <w:rPr>
+            <w:noProof/>
+            <w:webHidden/>
+          </w:rPr>
+          <w:fldChar w:fldCharType="separate"/>
+        </w:r>
+        <w:r>
+          <w:rPr>
+            <w:noProof/>
+            <w:webHidden/>
+          </w:rPr>
+          <w:t>21</w:t>
+        </w:r>
+        <w:r>
+          <w:rPr>
+            <w:noProof/>
+            <w:webHidden/>
+          </w:rPr>
+          <w:fldChar w:fldCharType="end"/>
+        </w:r>
+      </w:hyperlink>
+    </w:p>
+    <w:p>
+      <w:pPr>
+        <w:pStyle w:val="Banghinhminhhoa"/>
+        <w:tabs>
+          <w:tab w:val="right" w:leader="dot" w:pos="8999"/>
+        </w:tabs>
+        <w:spacing w:line="360" w:lineRule="auto"/>
+        <w:jc w:val="left"/>
+        <w:rPr>
+          <w:rFonts w:asciiTheme="minorHAnsi" w:eastAsiaTheme="minorEastAsia" w:hAnsiTheme="minorHAnsi"/>
+          <w:noProof/>
+          <w:kern w:val="2"/>
+          <w:sz w:val="24"/>
+          <w:szCs w:val="24"/>
+          <w:lang w:val="vi-VN" w:eastAsia="zh-CN"/>
+          <w14:ligatures w14:val="standardContextual"/>
+        </w:rPr>
+      </w:pPr>
+      <w:hyperlink w:anchor="_Toc242025709" w:history="1">
+        <w:r>
+          <w:rPr>
+            <w:rStyle w:val="Siuktni"/>
+            <w:noProof/>
+            <w:lang w:val="vi-VN" w:eastAsia="vi-VN"/>
+          </w:rPr>
+          <w:t>Hình 3.4: Pipeline xây dựng index vector (offline)</w:t>
+        </w:r>
+        <w:r>
+          <w:rPr>
+            <w:noProof/>
+            <w:webHidden/>
+          </w:rPr>
+          <w:tab/>
+        </w:r>
+        <w:r>
+          <w:rPr>
+            <w:noProof/>
+            <w:webHidden/>
+          </w:rPr>
+          <w:fldChar w:fldCharType="begin"/>
+        </w:r>
+        <w:r>
+          <w:rPr>
+            <w:noProof/>
+            <w:webHidden/>
+          </w:rPr>
+          <w:instrText xml:space="preserve"> PAGEREF _Toc242025709 \h </w:instrText>
+        </w:r>
+        <w:r>
+          <w:rPr>
+            <w:noProof/>
+            <w:webHidden/>
+          </w:rPr>
+        </w:r>
+        <w:r>
+          <w:rPr>
+            <w:noProof/>
+            <w:webHidden/>
+          </w:rPr>
+          <w:fldChar w:fldCharType="separate"/>
+        </w:r>
+        <w:r>
+          <w:rPr>
+            <w:noProof/>
+            <w:webHidden/>
+          </w:rPr>
+          <w:t>23</w:t>
+        </w:r>
+        <w:r>
+          <w:rPr>
+            <w:noProof/>
+            <w:webHidden/>
+          </w:rPr>
+          <w:fldChar w:fldCharType="end"/>
+        </w:r>
+      </w:hyperlink>
+    </w:p>
+    <w:p>
+      <w:pPr>
+        <w:pStyle w:val="Banghinhminhhoa"/>
+        <w:tabs>
+          <w:tab w:val="right" w:leader="dot" w:pos="8999"/>
+        </w:tabs>
+        <w:spacing w:line="360" w:lineRule="auto"/>
+        <w:jc w:val="left"/>
+        <w:rPr>
+          <w:rFonts w:asciiTheme="minorHAnsi" w:eastAsiaTheme="minorEastAsia" w:hAnsiTheme="minorHAnsi"/>
+          <w:noProof/>
+          <w:kern w:val="2"/>
+          <w:sz w:val="24"/>
+          <w:szCs w:val="24"/>
+          <w:lang w:val="vi-VN" w:eastAsia="zh-CN"/>
+          <w14:ligatures w14:val="standardContextual"/>
+        </w:rPr>
+      </w:pPr>
+      <w:hyperlink w:anchor="_Toc242025710" w:history="1">
+        <w:r>
+          <w:rPr>
+            <w:rStyle w:val="Siuktni"/>
+            <w:noProof/>
+            <w:lang w:eastAsia="vi-VN"/>
+          </w:rPr>
+          <w:t>Hình 3.5: Code minh họa - build_index() và search_vector() với ChromaDB</w:t>
+        </w:r>
+        <w:r>
+          <w:rPr>
+            <w:noProof/>
+            <w:webHidden/>
+          </w:rPr>
+          <w:tab/>
+        </w:r>
+        <w:r>
+          <w:rPr>
+            <w:noProof/>
+            <w:webHidden/>
+          </w:rPr>
+          <w:fldChar w:fldCharType="begin"/>
+        </w:r>
+        <w:r>
+          <w:rPr>
+            <w:noProof/>
+            <w:webHidden/>
+          </w:rPr>
+          <w:instrText xml:space="preserve"> PAGEREF _Toc242025710 \h </w:instrText>
+        </w:r>
+        <w:r>
+          <w:rPr>
+            <w:noProof/>
+            <w:webHidden/>
+          </w:rPr>
+        </w:r>
+        <w:r>
+          <w:rPr>
+            <w:noProof/>
+            <w:webHidden/>
+          </w:rPr>
+          <w:fldChar w:fldCharType="separate"/>
+        </w:r>
+        <w:r>
+          <w:rPr>
+            <w:noProof/>
+            <w:webHidden/>
+          </w:rPr>
+          <w:t>24</w:t>
+        </w:r>
+        <w:r>
+          <w:rPr>
+            <w:noProof/>
+            <w:webHidden/>
+          </w:rPr>
+          <w:fldChar w:fldCharType="end"/>
+        </w:r>
+      </w:hyperlink>
+    </w:p>
+    <w:p>
+      <w:pPr>
+        <w:pStyle w:val="Banghinhminhhoa"/>
+        <w:tabs>
+          <w:tab w:val="right" w:leader="dot" w:pos="8999"/>
+        </w:tabs>
+        <w:spacing w:line="360" w:lineRule="auto"/>
+        <w:jc w:val="left"/>
+        <w:rPr>
+          <w:rFonts w:asciiTheme="minorHAnsi" w:eastAsiaTheme="minorEastAsia" w:hAnsiTheme="minorHAnsi"/>
+          <w:noProof/>
+          <w:kern w:val="2"/>
+          <w:sz w:val="24"/>
+          <w:szCs w:val="24"/>
+          <w:lang w:val="vi-VN" w:eastAsia="zh-CN"/>
+          <w14:ligatures w14:val="standardContextual"/>
+        </w:rPr>
+      </w:pPr>
+      <w:hyperlink w:anchor="_Toc242025711" w:history="1">
+        <w:r>
+          <w:rPr>
+            <w:rStyle w:val="Siuktni"/>
+            <w:noProof/>
+            <w:lang w:val="vi-VN" w:eastAsia="vi-VN"/>
+          </w:rPr>
+          <w:t>Hình 3.6: Code minh họa - Chia dữ liệu theo nhóm faq_id (GroupShuffleSplit)</w:t>
+        </w:r>
+        <w:r>
+          <w:rPr>
+            <w:noProof/>
+            <w:webHidden/>
+          </w:rPr>
+          <w:tab/>
+        </w:r>
+        <w:r>
+          <w:rPr>
+            <w:noProof/>
+            <w:webHidden/>
+          </w:rPr>
+          <w:fldChar w:fldCharType="begin"/>
+        </w:r>
+        <w:r>
+          <w:rPr>
+            <w:noProof/>
+            <w:webHidden/>
+          </w:rPr>
+          <w:instrText xml:space="preserve"> PAGEREF _Toc242025711 \h </w:instrText>
+        </w:r>
+        <w:r>
+          <w:rPr>
+            <w:noProof/>
+            <w:webHidden/>
+          </w:rPr>
+        </w:r>
+        <w:r>
+          <w:rPr>
+            <w:noProof/>
+            <w:webHidden/>
+          </w:rPr>
+          <w:fldChar w:fldCharType="separate"/>
+        </w:r>
+        <w:r>
+          <w:rPr>
+            <w:noProof/>
+            <w:webHidden/>
+          </w:rPr>
+          <w:t>25</w:t>
+        </w:r>
+        <w:r>
+          <w:rPr>
+            <w:noProof/>
+            <w:webHidden/>
+          </w:rPr>
+          <w:fldChar w:fldCharType="end"/>
+        </w:r>
+      </w:hyperlink>
+    </w:p>
+    <w:p>
+      <w:pPr>
+        <w:pStyle w:val="Banghinhminhhoa"/>
+        <w:tabs>
+          <w:tab w:val="right" w:leader="dot" w:pos="8999"/>
+        </w:tabs>
+        <w:spacing w:line="360" w:lineRule="auto"/>
+        <w:jc w:val="left"/>
+        <w:rPr>
+          <w:rFonts w:asciiTheme="minorHAnsi" w:eastAsiaTheme="minorEastAsia" w:hAnsiTheme="minorHAnsi"/>
+          <w:noProof/>
+          <w:kern w:val="2"/>
+          <w:sz w:val="24"/>
+          <w:szCs w:val="24"/>
+          <w:lang w:val="vi-VN" w:eastAsia="zh-CN"/>
+          <w14:ligatures w14:val="standardContextual"/>
+        </w:rPr>
+      </w:pPr>
+      <w:hyperlink w:anchor="_Toc242025712" w:history="1">
+        <w:r>
+          <w:rPr>
+            <w:rStyle w:val="Siuktni"/>
+            <w:noProof/>
+            <w:lang w:val="vi-VN" w:eastAsia="vi-VN"/>
+          </w:rPr>
+          <w:t>Hình 3.7: Code minh họa - Lớp FinetunedEncoder (PhoBERT + ViTokenizer)</w:t>
+        </w:r>
+        <w:r>
+          <w:rPr>
+            <w:noProof/>
+            <w:webHidden/>
+          </w:rPr>
+          <w:tab/>
+        </w:r>
+        <w:r>
+          <w:rPr>
+            <w:noProof/>
+            <w:webHidden/>
+          </w:rPr>
+          <w:fldChar w:fldCharType="begin"/>
+        </w:r>
+        <w:r>
+          <w:rPr>
+            <w:noProof/>
+            <w:webHidden/>
+          </w:rPr>
+          <w:instrText xml:space="preserve"> PAGEREF _Toc242025712 \h </w:instrText>
+        </w:r>
+        <w:r>
+          <w:rPr>
+            <w:noProof/>
+            <w:webHidden/>
+          </w:rPr>
+        </w:r>
+        <w:r>
+          <w:rPr>
+            <w:noProof/>
+            <w:webHidden/>
+          </w:rPr>
+          <w:fldChar w:fldCharType="separate"/>
+        </w:r>
+        <w:r>
+          <w:rPr>
+            <w:noProof/>
+            <w:webHidden/>
+          </w:rPr>
+          <w:t>26</w:t>
+        </w:r>
+        <w:r>
+          <w:rPr>
+            <w:noProof/>
+            <w:webHidden/>
+          </w:rPr>
+          <w:fldChar w:fldCharType="end"/>
+        </w:r>
+      </w:hyperlink>
+    </w:p>
+    <w:p>
+      <w:pPr>
+        <w:pStyle w:val="Banghinhminhhoa"/>
+        <w:tabs>
+          <w:tab w:val="right" w:leader="dot" w:pos="8999"/>
+        </w:tabs>
+        <w:spacing w:line="360" w:lineRule="auto"/>
+        <w:jc w:val="left"/>
+        <w:rPr>
+          <w:rFonts w:asciiTheme="minorHAnsi" w:eastAsiaTheme="minorEastAsia" w:hAnsiTheme="minorHAnsi"/>
+          <w:noProof/>
+          <w:kern w:val="2"/>
+          <w:sz w:val="24"/>
+          <w:szCs w:val="24"/>
+          <w:lang w:val="vi-VN" w:eastAsia="zh-CN"/>
+          <w14:ligatures w14:val="standardContextual"/>
+        </w:rPr>
+      </w:pPr>
+      <w:hyperlink w:anchor="_Toc242025713" w:history="1">
+        <w:r>
+          <w:rPr>
+            <w:rStyle w:val="Siuktni"/>
+            <w:noProof/>
+            <w:lang w:val="vi-VN" w:eastAsia="vi-VN"/>
+          </w:rPr>
+          <w:t>Hình 3.8: Công thức toán học MultipleNegativesRankingLoss và cách triển khai</w:t>
+        </w:r>
+        <w:r>
+          <w:rPr>
+            <w:noProof/>
+            <w:webHidden/>
+          </w:rPr>
+          <w:tab/>
+        </w:r>
+        <w:r>
+          <w:rPr>
+            <w:noProof/>
+            <w:webHidden/>
+          </w:rPr>
+          <w:fldChar w:fldCharType="begin"/>
+        </w:r>
+        <w:r>
+          <w:rPr>
+            <w:noProof/>
+            <w:webHidden/>
+          </w:rPr>
+          <w:instrText xml:space="preserve"> PAGEREF _Toc242025713 \h </w:instrText>
+        </w:r>
+        <w:r>
+          <w:rPr>
+            <w:noProof/>
+            <w:webHidden/>
+          </w:rPr>
+        </w:r>
+        <w:r>
+          <w:rPr>
+            <w:noProof/>
+            <w:webHidden/>
+          </w:rPr>
+          <w:fldChar w:fldCharType="separate"/>
+        </w:r>
+        <w:r>
+          <w:rPr>
+            <w:noProof/>
+            <w:webHidden/>
+          </w:rPr>
+          <w:t>27</w:t>
+        </w:r>
+        <w:r>
+          <w:rPr>
+            <w:noProof/>
+            <w:webHidden/>
+          </w:rPr>
+          <w:fldChar w:fldCharType="end"/>
+        </w:r>
+      </w:hyperlink>
+    </w:p>
+    <w:p>
+      <w:pPr>
+        <w:pStyle w:val="Banghinhminhhoa"/>
+        <w:tabs>
+          <w:tab w:val="right" w:leader="dot" w:pos="8999"/>
+        </w:tabs>
+        <w:spacing w:line="360" w:lineRule="auto"/>
+        <w:jc w:val="left"/>
+        <w:rPr>
+          <w:rFonts w:asciiTheme="minorHAnsi" w:eastAsiaTheme="minorEastAsia" w:hAnsiTheme="minorHAnsi"/>
+          <w:noProof/>
+          <w:kern w:val="2"/>
+          <w:sz w:val="24"/>
+          <w:szCs w:val="24"/>
+          <w:lang w:val="vi-VN" w:eastAsia="zh-CN"/>
+          <w14:ligatures w14:val="standardContextual"/>
+        </w:rPr>
+      </w:pPr>
+      <w:hyperlink w:anchor="_Toc242025714" w:history="1">
+        <w:r>
+          <w:rPr>
+            <w:rStyle w:val="Siuktni"/>
+            <w:noProof/>
+            <w:lang w:val="vi-VN" w:eastAsia="vi-VN"/>
+          </w:rPr>
+          <w:t>Hình 3.9: Công thức toán học LoRA và cấu hình thực tế (r=16, α=16, 0.53% tham số)</w:t>
+        </w:r>
+        <w:r>
+          <w:rPr>
+            <w:noProof/>
+            <w:webHidden/>
+          </w:rPr>
+          <w:tab/>
+        </w:r>
+        <w:r>
+          <w:rPr>
+            <w:noProof/>
+            <w:webHidden/>
+          </w:rPr>
+          <w:fldChar w:fldCharType="begin"/>
+        </w:r>
+        <w:r>
+          <w:rPr>
+            <w:noProof/>
+            <w:webHidden/>
+          </w:rPr>
+          <w:instrText xml:space="preserve"> PAGEREF _Toc242025714 \h </w:instrText>
+        </w:r>
+        <w:r>
+          <w:rPr>
+            <w:noProof/>
+            <w:webHidden/>
+          </w:rPr>
+        </w:r>
+        <w:r>
+          <w:rPr>
+            <w:noProof/>
+            <w:webHidden/>
+          </w:rPr>
+          <w:fldChar w:fldCharType="separate"/>
+        </w:r>
+        <w:r>
+          <w:rPr>
+            <w:noProof/>
+            <w:webHidden/>
+          </w:rPr>
+          <w:t>30</w:t>
+        </w:r>
+        <w:r>
+          <w:rPr>
+            <w:noProof/>
+            <w:webHidden/>
+          </w:rPr>
+          <w:fldChar w:fldCharType="end"/>
+        </w:r>
+      </w:hyperlink>
+    </w:p>
+    <w:p>
+      <w:pPr>
+        <w:pStyle w:val="Banghinhminhhoa"/>
+        <w:tabs>
+          <w:tab w:val="right" w:leader="dot" w:pos="8999"/>
+        </w:tabs>
+        <w:spacing w:line="360" w:lineRule="auto"/>
+        <w:jc w:val="left"/>
+        <w:rPr>
+          <w:rFonts w:asciiTheme="minorHAnsi" w:eastAsiaTheme="minorEastAsia" w:hAnsiTheme="minorHAnsi"/>
+          <w:noProof/>
+          <w:kern w:val="2"/>
+          <w:sz w:val="24"/>
+          <w:szCs w:val="24"/>
+          <w:lang w:val="vi-VN" w:eastAsia="zh-CN"/>
+          <w14:ligatures w14:val="standardContextual"/>
+        </w:rPr>
+      </w:pPr>
+      <w:hyperlink w:anchor="_Toc242025715" w:history="1">
+        <w:r>
+          <w:rPr>
+            <w:rStyle w:val="Siuktni"/>
+            <w:noProof/>
+            <w:lang w:val="vi-VN"/>
+          </w:rPr>
+          <w:t>Hình 4.1: Ma trận phân bố rank – Số lượng truy vấn theo vị trí FAQ đúng trong kết quả top-5</w:t>
+        </w:r>
+        <w:r>
+          <w:rPr>
+            <w:noProof/>
+            <w:webHidden/>
+          </w:rPr>
+          <w:tab/>
+        </w:r>
+        <w:r>
+          <w:rPr>
+            <w:noProof/>
+            <w:webHidden/>
+          </w:rPr>
+          <w:fldChar w:fldCharType="begin"/>
+        </w:r>
+        <w:r>
+          <w:rPr>
+            <w:noProof/>
+            <w:webHidden/>
+          </w:rPr>
+          <w:instrText xml:space="preserve"> PAGEREF _Toc242025715 \h </w:instrText>
+        </w:r>
+        <w:r>
+          <w:rPr>
+            <w:noProof/>
+            <w:webHidden/>
+          </w:rPr>
+        </w:r>
+        <w:r>
+          <w:rPr>
+            <w:noProof/>
+            <w:webHidden/>
+          </w:rPr>
+          <w:fldChar w:fldCharType="separate"/>
+        </w:r>
+        <w:r>
+          <w:rPr>
+            <w:noProof/>
+            <w:webHidden/>
+          </w:rPr>
+          <w:t>34</w:t>
+        </w:r>
+        <w:r>
+          <w:rPr>
+            <w:noProof/>
+            <w:webHidden/>
+          </w:rPr>
+          <w:fldChar w:fldCharType="end"/>
+        </w:r>
+      </w:hyperlink>
+    </w:p>
+    <w:p>
+      <w:pPr>
+        <w:pStyle w:val="Banghinhminhhoa"/>
+        <w:tabs>
+          <w:tab w:val="right" w:leader="dot" w:pos="8999"/>
+        </w:tabs>
+        <w:spacing w:line="360" w:lineRule="auto"/>
+        <w:jc w:val="left"/>
+        <w:rPr>
+          <w:rFonts w:asciiTheme="minorHAnsi" w:eastAsiaTheme="minorEastAsia" w:hAnsiTheme="minorHAnsi"/>
+          <w:noProof/>
+          <w:kern w:val="2"/>
+          <w:sz w:val="24"/>
+          <w:szCs w:val="24"/>
+          <w:lang w:val="vi-VN" w:eastAsia="zh-CN"/>
+          <w14:ligatures w14:val="standardContextual"/>
+        </w:rPr>
+      </w:pPr>
+      <w:hyperlink w:anchor="_Toc242025716" w:history="1">
+        <w:r>
+          <w:rPr>
+            <w:rStyle w:val="Siuktni"/>
+            <w:noProof/>
+            <w:lang w:val="vi-VN"/>
+          </w:rPr>
+          <w:t>Hình 4.2: Biểu đồ so sánh các tiêu chí đánh giá giữa ba phương pháp</w:t>
+        </w:r>
+        <w:r>
+          <w:rPr>
+            <w:noProof/>
+            <w:webHidden/>
+          </w:rPr>
+          <w:tab/>
+        </w:r>
+        <w:r>
+          <w:rPr>
+            <w:noProof/>
+            <w:webHidden/>
+          </w:rPr>
+          <w:fldChar w:fldCharType="begin"/>
+        </w:r>
+        <w:r>
+          <w:rPr>
+            <w:noProof/>
+            <w:webHidden/>
+          </w:rPr>
+          <w:instrText xml:space="preserve"> PAGEREF _Toc242025716 \h </w:instrText>
+        </w:r>
+        <w:r>
+          <w:rPr>
+            <w:noProof/>
+            <w:webHidden/>
+          </w:rPr>
+        </w:r>
+        <w:r>
+          <w:rPr>
+            <w:noProof/>
+            <w:webHidden/>
+          </w:rPr>
+          <w:fldChar w:fldCharType="separate"/>
+        </w:r>
+        <w:r>
+          <w:rPr>
+            <w:noProof/>
+            <w:webHidden/>
+          </w:rPr>
+          <w:t>35</w:t>
+        </w:r>
+        <w:r>
+          <w:rPr>
+            <w:noProof/>
+            <w:webHidden/>
+          </w:rPr>
+          <w:fldChar w:fldCharType="end"/>
+        </w:r>
+      </w:hyperlink>
+    </w:p>
+    <w:p>
+      <w:pPr>
+        <w:pStyle w:val="Banghinhminhhoa"/>
+        <w:tabs>
+          <w:tab w:val="right" w:leader="dot" w:pos="8999"/>
+        </w:tabs>
+        <w:spacing w:line="360" w:lineRule="auto"/>
+        <w:jc w:val="left"/>
+        <w:rPr>
+          <w:rFonts w:asciiTheme="minorHAnsi" w:eastAsiaTheme="minorEastAsia" w:hAnsiTheme="minorHAnsi"/>
+          <w:noProof/>
+          <w:kern w:val="2"/>
+          <w:sz w:val="24"/>
+          <w:szCs w:val="24"/>
+          <w:lang w:val="vi-VN" w:eastAsia="zh-CN"/>
+          <w14:ligatures w14:val="standardContextual"/>
+        </w:rPr>
+      </w:pPr>
+      <w:hyperlink w:anchor="_Toc242025717" w:history="1">
+        <w:r>
+          <w:rPr>
+            <w:rStyle w:val="Siuktni"/>
+            <w:noProof/>
+          </w:rPr>
+          <w:t>Hình 4.3: Log so sánh TF-IDF vs PhoBERT gốc</w:t>
+        </w:r>
+        <w:r>
+          <w:rPr>
+            <w:noProof/>
+            <w:webHidden/>
+          </w:rPr>
+          <w:tab/>
+        </w:r>
+        <w:r>
+          <w:rPr>
+            <w:noProof/>
+            <w:webHidden/>
+          </w:rPr>
+          <w:fldChar w:fldCharType="begin"/>
+        </w:r>
+        <w:r>
+          <w:rPr>
+            <w:noProof/>
+            <w:webHidden/>
+          </w:rPr>
+          <w:instrText xml:space="preserve"> PAGEREF _Toc242025717 \h </w:instrText>
+        </w:r>
+        <w:r>
+          <w:rPr>
+            <w:noProof/>
+            <w:webHidden/>
+          </w:rPr>
+        </w:r>
+        <w:r>
+          <w:rPr>
+            <w:noProof/>
+            <w:webHidden/>
+          </w:rPr>
+          <w:fldChar w:fldCharType="separate"/>
+        </w:r>
+        <w:r>
+          <w:rPr>
+            <w:noProof/>
+            <w:webHidden/>
+          </w:rPr>
+          <w:t>36</w:t>
+        </w:r>
+        <w:r>
+          <w:rPr>
+            <w:noProof/>
+            <w:webHidden/>
+          </w:rPr>
+          <w:fldChar w:fldCharType="end"/>
+        </w:r>
+      </w:hyperlink>
+    </w:p>
+    <w:p>
+      <w:pPr>
+        <w:pStyle w:val="Banghinhminhhoa"/>
+        <w:tabs>
+          <w:tab w:val="right" w:leader="dot" w:pos="8999"/>
+        </w:tabs>
+        <w:spacing w:line="360" w:lineRule="auto"/>
+        <w:jc w:val="left"/>
+        <w:rPr>
+          <w:rFonts w:asciiTheme="minorHAnsi" w:eastAsiaTheme="minorEastAsia" w:hAnsiTheme="minorHAnsi"/>
+          <w:noProof/>
+          <w:kern w:val="2"/>
+          <w:sz w:val="24"/>
+          <w:szCs w:val="24"/>
+          <w:lang w:val="vi-VN" w:eastAsia="zh-CN"/>
+          <w14:ligatures w14:val="standardContextual"/>
+        </w:rPr>
+      </w:pPr>
+      <w:hyperlink w:anchor="_Toc242025718" w:history="1">
+        <w:r>
+          <w:rPr>
+            <w:rStyle w:val="Siuktni"/>
+            <w:noProof/>
+          </w:rPr>
+          <w:t>Hình 4.4: Đường cong loss trong quá trình huấn luyện PhoBERT Fine-tuned</w:t>
+        </w:r>
+        <w:r>
+          <w:rPr>
+            <w:noProof/>
+            <w:webHidden/>
+          </w:rPr>
+          <w:tab/>
+        </w:r>
+        <w:r>
+          <w:rPr>
+            <w:noProof/>
+            <w:webHidden/>
+          </w:rPr>
+          <w:fldChar w:fldCharType="begin"/>
+        </w:r>
+        <w:r>
+          <w:rPr>
+            <w:noProof/>
+            <w:webHidden/>
+          </w:rPr>
+          <w:instrText xml:space="preserve"> PAGEREF _Toc242025718 \h </w:instrText>
+        </w:r>
+        <w:r>
+          <w:rPr>
+            <w:noProof/>
+            <w:webHidden/>
+          </w:rPr>
+        </w:r>
+        <w:r>
+          <w:rPr>
+            <w:noProof/>
+            <w:webHidden/>
+          </w:rPr>
+          <w:fldChar w:fldCharType="separate"/>
+        </w:r>
+        <w:r>
+          <w:rPr>
+            <w:noProof/>
+            <w:webHidden/>
+          </w:rPr>
+          <w:t>37</w:t>
+        </w:r>
+        <w:r>
+          <w:rPr>
+            <w:noProof/>
+            <w:webHidden/>
+          </w:rPr>
+          <w:fldChar w:fldCharType="end"/>
+        </w:r>
+      </w:hyperlink>
+    </w:p>
+    <w:p>
+      <w:pPr>
+        <w:pStyle w:val="Banghinhminhhoa"/>
+        <w:tabs>
+          <w:tab w:val="right" w:leader="dot" w:pos="8999"/>
+        </w:tabs>
+        <w:spacing w:line="360" w:lineRule="auto"/>
+        <w:jc w:val="left"/>
+        <w:rPr>
+          <w:rFonts w:asciiTheme="minorHAnsi" w:eastAsiaTheme="minorEastAsia" w:hAnsiTheme="minorHAnsi"/>
+          <w:noProof/>
+          <w:kern w:val="2"/>
+          <w:sz w:val="24"/>
+          <w:szCs w:val="24"/>
+          <w:lang w:val="vi-VN" w:eastAsia="zh-CN"/>
+          <w14:ligatures w14:val="standardContextual"/>
+        </w:rPr>
+      </w:pPr>
+      <w:hyperlink w:anchor="_Toc242025719" w:history="1">
+        <w:r>
+          <w:rPr>
+            <w:rStyle w:val="Siuktni"/>
+            <w:noProof/>
+            <w:lang w:val="vi-VN"/>
+          </w:rPr>
+          <w:t>Hình 4.5: Đường cong loss trong quá trình fine-tune Qwen2.5-7B với LoRA</w:t>
+        </w:r>
+        <w:r>
+          <w:rPr>
+            <w:noProof/>
+            <w:webHidden/>
+          </w:rPr>
+          <w:tab/>
+        </w:r>
+        <w:r>
+          <w:rPr>
+            <w:noProof/>
+            <w:webHidden/>
+          </w:rPr>
+          <w:fldChar w:fldCharType="begin"/>
+        </w:r>
+        <w:r>
+          <w:rPr>
+            <w:noProof/>
+            <w:webHidden/>
+          </w:rPr>
+          <w:instrText xml:space="preserve"> PAGEREF _Toc242025719 \h </w:instrText>
+        </w:r>
+        <w:r>
+          <w:rPr>
+            <w:noProof/>
+            <w:webHidden/>
+          </w:rPr>
+        </w:r>
+        <w:r>
+          <w:rPr>
+            <w:noProof/>
+            <w:webHidden/>
+          </w:rPr>
+          <w:fldChar w:fldCharType="separate"/>
+        </w:r>
+        <w:r>
+          <w:rPr>
+            <w:noProof/>
+            <w:webHidden/>
+          </w:rPr>
+          <w:t>38</w:t>
+        </w:r>
+        <w:r>
+          <w:rPr>
+            <w:noProof/>
+            <w:webHidden/>
+          </w:rPr>
+          <w:fldChar w:fldCharType="end"/>
+        </w:r>
+      </w:hyperlink>
+    </w:p>
+    <w:p>
+      <w:pPr>
+        <w:pStyle w:val="Banghinhminhhoa"/>
+        <w:tabs>
+          <w:tab w:val="right" w:leader="dot" w:pos="8999"/>
+        </w:tabs>
+        <w:spacing w:line="360" w:lineRule="auto"/>
+        <w:jc w:val="left"/>
+        <w:rPr>
+          <w:rFonts w:asciiTheme="minorHAnsi" w:eastAsiaTheme="minorEastAsia" w:hAnsiTheme="minorHAnsi"/>
+          <w:noProof/>
+          <w:kern w:val="2"/>
+          <w:sz w:val="24"/>
+          <w:szCs w:val="24"/>
+          <w:lang w:val="vi-VN" w:eastAsia="zh-CN"/>
+          <w14:ligatures w14:val="standardContextual"/>
+        </w:rPr>
+      </w:pPr>
+      <w:hyperlink w:anchor="_Toc242025720" w:history="1">
+        <w:r>
+          <w:rPr>
+            <w:rStyle w:val="Siuktni"/>
+            <w:noProof/>
+          </w:rPr>
+          <w:t>Hình 4.6: Lịch trình learning rate (warmup + cosine decay) trong quá trình fine-tune Qwen2.5-7B</w:t>
+        </w:r>
+        <w:r>
+          <w:rPr>
+            <w:noProof/>
+            <w:webHidden/>
+          </w:rPr>
+          <w:tab/>
+        </w:r>
+        <w:r>
+          <w:rPr>
+            <w:noProof/>
+            <w:webHidden/>
+          </w:rPr>
+          <w:fldChar w:fldCharType="begin"/>
+        </w:r>
+        <w:r>
+          <w:rPr>
+            <w:noProof/>
+            <w:webHidden/>
+          </w:rPr>
+          <w:instrText xml:space="preserve"> PAGEREF _Toc242025720 \h </w:instrText>
+        </w:r>
+        <w:r>
+          <w:rPr>
+            <w:noProof/>
+            <w:webHidden/>
+          </w:rPr>
+        </w:r>
+        <w:r>
+          <w:rPr>
+            <w:noProof/>
+            <w:webHidden/>
+          </w:rPr>
+          <w:fldChar w:fldCharType="separate"/>
+        </w:r>
+        <w:r>
+          <w:rPr>
+            <w:noProof/>
+            <w:webHidden/>
+          </w:rPr>
+          <w:t>39</w:t>
+        </w:r>
+        <w:r>
+          <w:rPr>
+            <w:noProof/>
+            <w:webHidden/>
+          </w:rPr>
+          <w:fldChar w:fldCharType="end"/>
+        </w:r>
+      </w:hyperlink>
+    </w:p>
+    <w:p>
+      <w:pPr>
+        <w:pStyle w:val="Banghinhminhhoa"/>
+        <w:tabs>
+          <w:tab w:val="right" w:leader="dot" w:pos="8999"/>
+        </w:tabs>
+        <w:spacing w:line="360" w:lineRule="auto"/>
+        <w:jc w:val="left"/>
+        <w:rPr>
+          <w:rFonts w:asciiTheme="minorHAnsi" w:eastAsiaTheme="minorEastAsia" w:hAnsiTheme="minorHAnsi"/>
+          <w:noProof/>
+          <w:kern w:val="2"/>
+          <w:sz w:val="24"/>
+          <w:szCs w:val="24"/>
+          <w:lang w:val="vi-VN" w:eastAsia="zh-CN"/>
+          <w14:ligatures w14:val="standardContextual"/>
+        </w:rPr>
+      </w:pPr>
+      <w:hyperlink w:anchor="_Toc242025721" w:history="1">
+        <w:r>
+          <w:rPr>
+            <w:rStyle w:val="Siuktni"/>
+            <w:noProof/>
+          </w:rPr>
+          <w:t>Hình 5.1: Giao diện chính của hệ thống</w:t>
+        </w:r>
+        <w:r>
+          <w:rPr>
+            <w:noProof/>
+            <w:webHidden/>
+          </w:rPr>
+          <w:tab/>
+        </w:r>
+        <w:r>
+          <w:rPr>
+            <w:noProof/>
+            <w:webHidden/>
+          </w:rPr>
+          <w:fldChar w:fldCharType="begin"/>
+        </w:r>
+        <w:r>
+          <w:rPr>
+            <w:noProof/>
+            <w:webHidden/>
+          </w:rPr>
+          <w:instrText xml:space="preserve"> PAGEREF _Toc242025721 \h </w:instrText>
+        </w:r>
+        <w:r>
+          <w:rPr>
+            <w:noProof/>
+            <w:webHidden/>
+          </w:rPr>
+        </w:r>
+        <w:r>
+          <w:rPr>
+            <w:noProof/>
+            <w:webHidden/>
+          </w:rPr>
+          <w:fldChar w:fldCharType="separate"/>
+        </w:r>
+        <w:r>
+          <w:rPr>
+            <w:noProof/>
+            <w:webHidden/>
+          </w:rPr>
+          <w:t>43</w:t>
+        </w:r>
+        <w:r>
+          <w:rPr>
+            <w:noProof/>
+            <w:webHidden/>
+          </w:rPr>
+          <w:fldChar w:fldCharType="end"/>
+        </w:r>
+      </w:hyperlink>
+    </w:p>
+    <w:p>
+      <w:pPr>
+        <w:pStyle w:val="Banghinhminhhoa"/>
+        <w:tabs>
+          <w:tab w:val="right" w:leader="dot" w:pos="8999"/>
+        </w:tabs>
+        <w:spacing w:line="360" w:lineRule="auto"/>
+        <w:jc w:val="left"/>
+        <w:rPr>
+          <w:rFonts w:asciiTheme="minorHAnsi" w:eastAsiaTheme="minorEastAsia" w:hAnsiTheme="minorHAnsi"/>
+          <w:noProof/>
+          <w:kern w:val="2"/>
+          <w:sz w:val="24"/>
+          <w:szCs w:val="24"/>
+          <w:lang w:val="vi-VN" w:eastAsia="zh-CN"/>
+          <w14:ligatures w14:val="standardContextual"/>
+        </w:rPr>
+      </w:pPr>
+      <w:hyperlink w:anchor="_Toc242025722" w:history="1">
+        <w:r>
+          <w:rPr>
+            <w:rStyle w:val="Siuktni"/>
+            <w:noProof/>
+            <w:lang w:val="vi-VN"/>
+          </w:rPr>
+          <w:t>Hình 5.2: Kịch bản 1 – Mode 1 (Chỉ Retrieval), câu hỏi trong phạm vi</w:t>
+        </w:r>
+        <w:r>
+          <w:rPr>
+            <w:noProof/>
+            <w:webHidden/>
+          </w:rPr>
+          <w:tab/>
+        </w:r>
+        <w:r>
+          <w:rPr>
+            <w:noProof/>
+            <w:webHidden/>
+          </w:rPr>
+          <w:fldChar w:fldCharType="begin"/>
+        </w:r>
+        <w:r>
+          <w:rPr>
+            <w:noProof/>
+            <w:webHidden/>
+          </w:rPr>
+          <w:instrText xml:space="preserve"> PAGEREF _Toc242025722 \h </w:instrText>
+        </w:r>
+        <w:r>
+          <w:rPr>
+            <w:noProof/>
+            <w:webHidden/>
+          </w:rPr>
+        </w:r>
+        <w:r>
+          <w:rPr>
+            <w:noProof/>
+            <w:webHidden/>
+          </w:rPr>
+          <w:fldChar w:fldCharType="separate"/>
+        </w:r>
+        <w:r>
+          <w:rPr>
+            <w:noProof/>
+            <w:webHidden/>
+          </w:rPr>
+          <w:t>44</w:t>
+        </w:r>
+        <w:r>
+          <w:rPr>
+            <w:noProof/>
+            <w:webHidden/>
+          </w:rPr>
+          <w:fldChar w:fldCharType="end"/>
+        </w:r>
+      </w:hyperlink>
+    </w:p>
+    <w:p>
+      <w:pPr>
+        <w:pStyle w:val="Banghinhminhhoa"/>
+        <w:tabs>
+          <w:tab w:val="right" w:leader="dot" w:pos="8999"/>
+        </w:tabs>
+        <w:spacing w:line="360" w:lineRule="auto"/>
+        <w:jc w:val="left"/>
+        <w:rPr>
+          <w:rFonts w:asciiTheme="minorHAnsi" w:eastAsiaTheme="minorEastAsia" w:hAnsiTheme="minorHAnsi"/>
+          <w:noProof/>
+          <w:kern w:val="2"/>
+          <w:sz w:val="24"/>
+          <w:szCs w:val="24"/>
+          <w:lang w:val="vi-VN" w:eastAsia="zh-CN"/>
+          <w14:ligatures w14:val="standardContextual"/>
+        </w:rPr>
+      </w:pPr>
+      <w:hyperlink w:anchor="_Toc242025723" w:history="1">
+        <w:r>
+          <w:rPr>
+            <w:rStyle w:val="Siuktni"/>
+            <w:noProof/>
+            <w:lang w:val="vi-VN"/>
+          </w:rPr>
+          <w:t>Hình 5.3: Kịch bản 2 – Mode 2 (RAG), tổng hợp từ top-K FAQ thông qua Qwen3.5:9b</w:t>
+        </w:r>
+        <w:r>
+          <w:rPr>
+            <w:noProof/>
+            <w:webHidden/>
+          </w:rPr>
+          <w:tab/>
+        </w:r>
+        <w:r>
+          <w:rPr>
+            <w:noProof/>
+            <w:webHidden/>
+          </w:rPr>
+          <w:fldChar w:fldCharType="begin"/>
+        </w:r>
+        <w:r>
+          <w:rPr>
+            <w:noProof/>
+            <w:webHidden/>
+          </w:rPr>
+          <w:instrText xml:space="preserve"> PAGEREF _Toc242025723 \h </w:instrText>
+        </w:r>
+        <w:r>
+          <w:rPr>
+            <w:noProof/>
+            <w:webHidden/>
+          </w:rPr>
+        </w:r>
+        <w:r>
+          <w:rPr>
+            <w:noProof/>
+            <w:webHidden/>
+          </w:rPr>
+          <w:fldChar w:fldCharType="separate"/>
+        </w:r>
+        <w:r>
+          <w:rPr>
+            <w:noProof/>
+            <w:webHidden/>
+          </w:rPr>
+          <w:t>45</w:t>
+        </w:r>
+        <w:r>
+          <w:rPr>
+            <w:noProof/>
+            <w:webHidden/>
+          </w:rPr>
+          <w:fldChar w:fldCharType="end"/>
+        </w:r>
+      </w:hyperlink>
+    </w:p>
+    <w:p>
+      <w:pPr>
+        <w:pStyle w:val="Banghinhminhhoa"/>
+        <w:tabs>
+          <w:tab w:val="right" w:leader="dot" w:pos="8999"/>
+        </w:tabs>
+        <w:spacing w:line="360" w:lineRule="auto"/>
+        <w:jc w:val="left"/>
+        <w:rPr>
+          <w:rFonts w:asciiTheme="minorHAnsi" w:eastAsiaTheme="minorEastAsia" w:hAnsiTheme="minorHAnsi"/>
+          <w:noProof/>
+          <w:kern w:val="2"/>
+          <w:sz w:val="24"/>
+          <w:szCs w:val="24"/>
+          <w:lang w:val="vi-VN" w:eastAsia="zh-CN"/>
+          <w14:ligatures w14:val="standardContextual"/>
+        </w:rPr>
+      </w:pPr>
+      <w:hyperlink w:anchor="_Toc242025724" w:history="1">
+        <w:r>
+          <w:rPr>
+            <w:rStyle w:val="Siuktni"/>
+            <w:noProof/>
+            <w:lang w:val="vi-VN"/>
+          </w:rPr>
+          <w:t>Hình 5.4: Kịch bản 3 – Mode 3 (Hybrid), fallback sang Qwen2.5-7B LoRA khi retrieval dưới ngưỡng</w:t>
+        </w:r>
+        <w:r>
+          <w:rPr>
+            <w:noProof/>
+            <w:webHidden/>
+          </w:rPr>
+          <w:tab/>
+        </w:r>
+        <w:r>
+          <w:rPr>
+            <w:noProof/>
+            <w:webHidden/>
+          </w:rPr>
+          <w:fldChar w:fldCharType="begin"/>
+        </w:r>
+        <w:r>
+          <w:rPr>
+            <w:noProof/>
+            <w:webHidden/>
+          </w:rPr>
+          <w:instrText xml:space="preserve"> PAGEREF _Toc242025724 \h </w:instrText>
+        </w:r>
+        <w:r>
+          <w:rPr>
+            <w:noProof/>
+            <w:webHidden/>
+          </w:rPr>
+        </w:r>
+        <w:r>
+          <w:rPr>
+            <w:noProof/>
+            <w:webHidden/>
+          </w:rPr>
+          <w:fldChar w:fldCharType="separate"/>
+        </w:r>
+        <w:r>
+          <w:rPr>
+            <w:noProof/>
+            <w:webHidden/>
+          </w:rPr>
+          <w:t>46</w:t>
+        </w:r>
+        <w:r>
+          <w:rPr>
+            <w:noProof/>
+            <w:webHidden/>
+          </w:rPr>
+          <w:fldChar w:fldCharType="end"/>
+        </w:r>
+      </w:hyperlink>
+    </w:p>
+    <w:p>
+      <w:pPr>
+        <w:pStyle w:val="Banghinhminhhoa"/>
+        <w:tabs>
+          <w:tab w:val="right" w:leader="dot" w:pos="8999"/>
+        </w:tabs>
+        <w:spacing w:line="360" w:lineRule="auto"/>
+        <w:jc w:val="left"/>
+        <w:rPr>
+          <w:rFonts w:asciiTheme="minorHAnsi" w:eastAsiaTheme="minorEastAsia" w:hAnsiTheme="minorHAnsi"/>
+          <w:noProof/>
+          <w:kern w:val="2"/>
+          <w:sz w:val="24"/>
+          <w:szCs w:val="24"/>
+          <w:lang w:val="vi-VN" w:eastAsia="zh-CN"/>
+          <w14:ligatures w14:val="standardContextual"/>
+        </w:rPr>
+      </w:pPr>
+      <w:hyperlink w:anchor="_Toc242025725" w:history="1">
+        <w:r>
+          <w:rPr>
+            <w:rStyle w:val="Siuktni"/>
+            <w:noProof/>
+            <w:lang w:val="vi-VN"/>
+          </w:rPr>
+          <w:t>Hình 5.5: Kịch bản 4 – Mode 1</w:t>
+        </w:r>
+        <w:r>
+          <w:rPr>
+            <w:noProof/>
+            <w:webHidden/>
+          </w:rPr>
+          <w:tab/>
+        </w:r>
+        <w:r>
+          <w:rPr>
+            <w:noProof/>
+            <w:webHidden/>
+          </w:rPr>
+          <w:fldChar w:fldCharType="begin"/>
+        </w:r>
+        <w:r>
+          <w:rPr>
+            <w:noProof/>
+            <w:webHidden/>
+          </w:rPr>
+          <w:instrText xml:space="preserve"> PAGEREF _Toc242025725 \h </w:instrText>
+        </w:r>
+        <w:r>
+          <w:rPr>
+            <w:noProof/>
+            <w:webHidden/>
+          </w:rPr>
+        </w:r>
+        <w:r>
+          <w:rPr>
+            <w:noProof/>
+            <w:webHidden/>
+          </w:rPr>
+          <w:fldChar w:fldCharType="separate"/>
+        </w:r>
+        <w:r>
+          <w:rPr>
+            <w:noProof/>
+            <w:webHidden/>
+          </w:rPr>
+          <w:t>47</w:t>
+        </w:r>
+        <w:r>
+          <w:rPr>
+            <w:noProof/>
+            <w:webHidden/>
+          </w:rPr>
+          <w:fldChar w:fldCharType="end"/>
+        </w:r>
+      </w:hyperlink>
+    </w:p>
+    <w:p>
+      <w:pPr>
+        <w:pStyle w:val="Banghinhminhhoa"/>
+        <w:tabs>
+          <w:tab w:val="right" w:leader="dot" w:pos="8999"/>
+        </w:tabs>
+        <w:spacing w:line="360" w:lineRule="auto"/>
+        <w:jc w:val="left"/>
+        <w:rPr>
+          <w:rFonts w:asciiTheme="minorHAnsi" w:eastAsiaTheme="minorEastAsia" w:hAnsiTheme="minorHAnsi"/>
+          <w:noProof/>
+          <w:kern w:val="2"/>
+          <w:sz w:val="24"/>
+          <w:szCs w:val="24"/>
+          <w:lang w:val="vi-VN" w:eastAsia="zh-CN"/>
+          <w14:ligatures w14:val="standardContextual"/>
+        </w:rPr>
+      </w:pPr>
+      <w:hyperlink w:anchor="_Toc242025726" w:history="1">
+        <w:r>
+          <w:rPr>
+            <w:rStyle w:val="Siuktni"/>
+            <w:noProof/>
+            <w:lang w:val="vi-VN"/>
+          </w:rPr>
+          <w:t>Hình 5.6: Kịch bản 4 – Mode 2</w:t>
+        </w:r>
+        <w:r>
+          <w:rPr>
+            <w:noProof/>
+            <w:webHidden/>
+          </w:rPr>
+          <w:tab/>
+        </w:r>
+        <w:r>
+          <w:rPr>
+            <w:noProof/>
+            <w:webHidden/>
+          </w:rPr>
+          <w:fldChar w:fldCharType="begin"/>
+        </w:r>
+        <w:r>
+          <w:rPr>
+            <w:noProof/>
+            <w:webHidden/>
+          </w:rPr>
+          <w:instrText xml:space="preserve"> PAGEREF _Toc242025726 \h </w:instrText>
+        </w:r>
+        <w:r>
+          <w:rPr>
+            <w:noProof/>
+            <w:webHidden/>
+          </w:rPr>
+        </w:r>
+        <w:r>
+          <w:rPr>
+            <w:noProof/>
+            <w:webHidden/>
+          </w:rPr>
+          <w:fldChar w:fldCharType="separate"/>
+        </w:r>
+        <w:r>
+          <w:rPr>
+            <w:noProof/>
+            <w:webHidden/>
+          </w:rPr>
+          <w:t>47</w:t>
+        </w:r>
+        <w:r>
+          <w:rPr>
+            <w:noProof/>
+            <w:webHidden/>
+          </w:rPr>
+          <w:fldChar w:fldCharType="end"/>
+        </w:r>
+      </w:hyperlink>
+    </w:p>
+    <w:p>
+      <w:pPr>
+        <w:pStyle w:val="Banghinhminhhoa"/>
+        <w:tabs>
+          <w:tab w:val="right" w:leader="dot" w:pos="8999"/>
+        </w:tabs>
+        <w:spacing w:line="360" w:lineRule="auto"/>
+        <w:jc w:val="left"/>
+        <w:rPr>
+          <w:rFonts w:asciiTheme="minorHAnsi" w:eastAsiaTheme="minorEastAsia" w:hAnsiTheme="minorHAnsi"/>
+          <w:noProof/>
+          <w:kern w:val="2"/>
+          <w:sz w:val="24"/>
+          <w:szCs w:val="24"/>
+          <w:lang w:val="vi-VN" w:eastAsia="zh-CN"/>
+          <w14:ligatures w14:val="standardContextual"/>
+        </w:rPr>
+      </w:pPr>
+      <w:hyperlink w:anchor="_Toc242025727" w:history="1">
+        <w:r>
+          <w:rPr>
+            <w:rStyle w:val="Siuktni"/>
+            <w:noProof/>
+            <w:lang w:val="vi-VN"/>
+          </w:rPr>
+          <w:t>Hình 5.7: Kịch bản 4 – Mode 3</w:t>
+        </w:r>
+        <w:r>
+          <w:rPr>
+            <w:noProof/>
+            <w:webHidden/>
+          </w:rPr>
+          <w:tab/>
+        </w:r>
+        <w:r>
+          <w:rPr>
+            <w:noProof/>
+            <w:webHidden/>
+          </w:rPr>
+          <w:fldChar w:fldCharType="begin"/>
+        </w:r>
+        <w:r>
+          <w:rPr>
+            <w:noProof/>
+            <w:webHidden/>
+          </w:rPr>
+          <w:instrText xml:space="preserve"> PAGEREF _Toc242025727 \h </w:instrText>
+        </w:r>
+        <w:r>
+          <w:rPr>
+            <w:noProof/>
+            <w:webHidden/>
+          </w:rPr>
+        </w:r>
+        <w:r>
+          <w:rPr>
+            <w:noProof/>
+            <w:webHidden/>
+          </w:rPr>
+          <w:fldChar w:fldCharType="separate"/>
+        </w:r>
+        <w:r>
+          <w:rPr>
+            <w:noProof/>
+            <w:webHidden/>
+          </w:rPr>
+          <w:t>47</w:t>
+        </w:r>
+        <w:r>
+          <w:rPr>
+            <w:noProof/>
+            <w:webHidden/>
+          </w:rPr>
+          <w:fldChar w:fldCharType="end"/>
+        </w:r>
+      </w:hyperlink>
+    </w:p>
+    <w:p>
+      <w:pPr>
+        <w:pStyle w:val="Banghinhminhhoa"/>
+        <w:tabs>
+          <w:tab w:val="right" w:leader="dot" w:pos="8999"/>
+        </w:tabs>
+        <w:spacing w:line="360" w:lineRule="auto"/>
+        <w:ind w:firstLine="0"/>
+        <w:jc w:val="left"/>
         <w:rPr>
           <w:rFonts w:asciiTheme="minorHAnsi" w:eastAsiaTheme="minorEastAsia" w:hAnsiTheme="minorHAnsi"/>
           <w:noProof/>
@@ -7270,6 +9054,9 @@
         </w:rPr>
       </w:pPr>
       <w:r>
+        <w:fldChar w:fldCharType="end"/>
+      </w:r>
+      <w:r>
         <w:fldChar w:fldCharType="begin"/>
       </w:r>
       <w:r>
@@ -7278,1768 +9065,12 @@
       <w:r>
         <w:fldChar w:fldCharType="separate"/>
       </w:r>
-      <w:hyperlink w:anchor="_Toc225706666" w:history="1">
-        <w:r>
-          <w:rPr>
-            <w:rStyle w:val="Siuktni"/>
-            <w:noProof/>
-            <w:lang w:val="vi-VN" w:eastAsia="vi-VN"/>
-          </w:rPr>
-          <w:t>Hình 2.1: Pipeline tiền xử lý văn bản tiếng Việt</w:t>
-        </w:r>
-        <w:r>
-          <w:rPr>
-            <w:noProof/>
-            <w:webHidden/>
-          </w:rPr>
-          <w:tab/>
-        </w:r>
-        <w:r>
-          <w:rPr>
-            <w:noProof/>
-            <w:webHidden/>
-          </w:rPr>
-          <w:fldChar w:fldCharType="begin"/>
-        </w:r>
-        <w:r>
-          <w:rPr>
-            <w:noProof/>
-            <w:webHidden/>
-          </w:rPr>
-          <w:instrText xml:space="preserve"> PAGEREF _Toc225706666 \h </w:instrText>
-        </w:r>
-        <w:r>
-          <w:rPr>
-            <w:noProof/>
-            <w:webHidden/>
-          </w:rPr>
-        </w:r>
-        <w:r>
-          <w:rPr>
-            <w:noProof/>
-            <w:webHidden/>
-          </w:rPr>
-          <w:fldChar w:fldCharType="separate"/>
-        </w:r>
-        <w:r>
-          <w:rPr>
-            <w:noProof/>
-            <w:webHidden/>
-          </w:rPr>
-          <w:t>14</w:t>
-        </w:r>
-        <w:r>
-          <w:rPr>
-            <w:noProof/>
-            <w:webHidden/>
-          </w:rPr>
-          <w:fldChar w:fldCharType="end"/>
-        </w:r>
-      </w:hyperlink>
-    </w:p>
-    <w:p>
-      <w:pPr>
-        <w:pStyle w:val="Banghinhminhhoa"/>
-        <w:tabs>
-          <w:tab w:val="right" w:leader="dot" w:pos="8999"/>
-        </w:tabs>
-        <w:spacing w:line="360" w:lineRule="auto"/>
-        <w:rPr>
-          <w:rFonts w:asciiTheme="minorHAnsi" w:eastAsiaTheme="minorEastAsia" w:hAnsiTheme="minorHAnsi"/>
-          <w:noProof/>
-          <w:kern w:val="2"/>
-          <w:sz w:val="24"/>
-          <w:szCs w:val="24"/>
-          <w:lang w:val="vi-VN" w:eastAsia="vi-VN"/>
-          <w14:ligatures w14:val="standardContextual"/>
-        </w:rPr>
-      </w:pPr>
-      <w:hyperlink w:anchor="_Toc225706667" w:history="1">
-        <w:r>
-          <w:rPr>
-            <w:rStyle w:val="Siuktni"/>
-            <w:noProof/>
-            <w:lang w:val="vi-VN"/>
-          </w:rPr>
-          <w:t>Hình 3.1: Code minh họa - Xây dựng và đánh giá TF-IDF Baseline</w:t>
-        </w:r>
-        <w:r>
-          <w:rPr>
-            <w:noProof/>
-            <w:webHidden/>
-          </w:rPr>
-          <w:tab/>
-        </w:r>
-        <w:r>
-          <w:rPr>
-            <w:noProof/>
-            <w:webHidden/>
-          </w:rPr>
-          <w:fldChar w:fldCharType="begin"/>
-        </w:r>
-        <w:r>
-          <w:rPr>
-            <w:noProof/>
-            <w:webHidden/>
-          </w:rPr>
-          <w:instrText xml:space="preserve"> PAGEREF _Toc225706667 \h </w:instrText>
-        </w:r>
-        <w:r>
-          <w:rPr>
-            <w:noProof/>
-            <w:webHidden/>
-          </w:rPr>
-        </w:r>
-        <w:r>
-          <w:rPr>
-            <w:noProof/>
-            <w:webHidden/>
-          </w:rPr>
-          <w:fldChar w:fldCharType="separate"/>
-        </w:r>
-        <w:r>
-          <w:rPr>
-            <w:noProof/>
-            <w:webHidden/>
-          </w:rPr>
-          <w:t>19</w:t>
-        </w:r>
-        <w:r>
-          <w:rPr>
-            <w:noProof/>
-            <w:webHidden/>
-          </w:rPr>
-          <w:fldChar w:fldCharType="end"/>
-        </w:r>
-      </w:hyperlink>
-    </w:p>
-    <w:p>
-      <w:pPr>
-        <w:pStyle w:val="Banghinhminhhoa"/>
-        <w:tabs>
-          <w:tab w:val="right" w:leader="dot" w:pos="8999"/>
-        </w:tabs>
-        <w:spacing w:line="360" w:lineRule="auto"/>
-        <w:rPr>
-          <w:rFonts w:asciiTheme="minorHAnsi" w:eastAsiaTheme="minorEastAsia" w:hAnsiTheme="minorHAnsi"/>
-          <w:noProof/>
-          <w:kern w:val="2"/>
-          <w:sz w:val="24"/>
-          <w:szCs w:val="24"/>
-          <w:lang w:val="vi-VN" w:eastAsia="vi-VN"/>
-          <w14:ligatures w14:val="standardContextual"/>
-        </w:rPr>
-      </w:pPr>
-      <w:hyperlink w:anchor="_Toc225706668" w:history="1">
-        <w:r>
-          <w:rPr>
-            <w:rStyle w:val="Siuktni"/>
-            <w:noProof/>
-            <w:lang w:val="vi-VN"/>
-          </w:rPr>
-          <w:t>Hình 3.2: Code minh họa - Hàm llm_generate_answer() (RAG với Ollama API)</w:t>
-        </w:r>
-        <w:r>
-          <w:rPr>
-            <w:noProof/>
-            <w:webHidden/>
-          </w:rPr>
-          <w:tab/>
-        </w:r>
-        <w:r>
-          <w:rPr>
-            <w:noProof/>
-            <w:webHidden/>
-          </w:rPr>
-          <w:fldChar w:fldCharType="begin"/>
-        </w:r>
-        <w:r>
-          <w:rPr>
-            <w:noProof/>
-            <w:webHidden/>
-          </w:rPr>
-          <w:instrText xml:space="preserve"> PAGEREF _Toc225706668 \h </w:instrText>
-        </w:r>
-        <w:r>
-          <w:rPr>
-            <w:noProof/>
-            <w:webHidden/>
-          </w:rPr>
-        </w:r>
-        <w:r>
-          <w:rPr>
-            <w:noProof/>
-            <w:webHidden/>
-          </w:rPr>
-          <w:fldChar w:fldCharType="separate"/>
-        </w:r>
-        <w:r>
-          <w:rPr>
-            <w:noProof/>
-            <w:webHidden/>
-          </w:rPr>
-          <w:t>20</w:t>
-        </w:r>
-        <w:r>
-          <w:rPr>
-            <w:noProof/>
-            <w:webHidden/>
-          </w:rPr>
-          <w:fldChar w:fldCharType="end"/>
-        </w:r>
-      </w:hyperlink>
-    </w:p>
-    <w:p>
-      <w:pPr>
-        <w:pStyle w:val="Banghinhminhhoa"/>
-        <w:tabs>
-          <w:tab w:val="right" w:leader="dot" w:pos="8999"/>
-        </w:tabs>
-        <w:spacing w:line="360" w:lineRule="auto"/>
-        <w:rPr>
-          <w:rFonts w:asciiTheme="minorHAnsi" w:eastAsiaTheme="minorEastAsia" w:hAnsiTheme="minorHAnsi"/>
-          <w:noProof/>
-          <w:kern w:val="2"/>
-          <w:sz w:val="24"/>
-          <w:szCs w:val="24"/>
-          <w:lang w:val="vi-VN" w:eastAsia="vi-VN"/>
-          <w14:ligatures w14:val="standardContextual"/>
-        </w:rPr>
-      </w:pPr>
-      <w:hyperlink w:anchor="_Toc225706669" w:history="1">
-        <w:r>
-          <w:rPr>
-            <w:rStyle w:val="Siuktni"/>
-            <w:noProof/>
-            <w:lang w:val="vi-VN" w:eastAsia="vi-VN"/>
-          </w:rPr>
-          <w:t>Hình 3.3: Kiến trúc tổng quan hệ thống Hybrid FAQ + Generative RAG</w:t>
-        </w:r>
-        <w:r>
-          <w:rPr>
-            <w:noProof/>
-            <w:webHidden/>
-          </w:rPr>
-          <w:tab/>
-        </w:r>
-        <w:r>
-          <w:rPr>
-            <w:noProof/>
-            <w:webHidden/>
-          </w:rPr>
-          <w:fldChar w:fldCharType="begin"/>
-        </w:r>
-        <w:r>
-          <w:rPr>
-            <w:noProof/>
-            <w:webHidden/>
-          </w:rPr>
-          <w:instrText xml:space="preserve"> PAGEREF _Toc225706669 \h </w:instrText>
-        </w:r>
-        <w:r>
-          <w:rPr>
-            <w:noProof/>
-            <w:webHidden/>
-          </w:rPr>
-        </w:r>
-        <w:r>
-          <w:rPr>
-            <w:noProof/>
-            <w:webHidden/>
-          </w:rPr>
-          <w:fldChar w:fldCharType="separate"/>
-        </w:r>
-        <w:r>
-          <w:rPr>
-            <w:noProof/>
-            <w:webHidden/>
-          </w:rPr>
-          <w:t>21</w:t>
-        </w:r>
-        <w:r>
-          <w:rPr>
-            <w:noProof/>
-            <w:webHidden/>
-          </w:rPr>
-          <w:fldChar w:fldCharType="end"/>
-        </w:r>
-      </w:hyperlink>
-    </w:p>
-    <w:p>
-      <w:pPr>
-        <w:pStyle w:val="Banghinhminhhoa"/>
-        <w:tabs>
-          <w:tab w:val="right" w:leader="dot" w:pos="8999"/>
-        </w:tabs>
-        <w:spacing w:line="360" w:lineRule="auto"/>
-        <w:rPr>
-          <w:rFonts w:asciiTheme="minorHAnsi" w:eastAsiaTheme="minorEastAsia" w:hAnsiTheme="minorHAnsi"/>
-          <w:noProof/>
-          <w:kern w:val="2"/>
-          <w:sz w:val="24"/>
-          <w:szCs w:val="24"/>
-          <w:lang w:val="vi-VN" w:eastAsia="vi-VN"/>
-          <w14:ligatures w14:val="standardContextual"/>
-        </w:rPr>
-      </w:pPr>
-      <w:hyperlink w:anchor="_Toc225706670" w:history="1">
-        <w:r>
-          <w:rPr>
-            <w:rStyle w:val="Siuktni"/>
-            <w:noProof/>
-            <w:lang w:val="vi-VN" w:eastAsia="vi-VN"/>
-          </w:rPr>
-          <w:t>Hình 3.4: Pipeline xây dựng index vector (offline)</w:t>
-        </w:r>
-        <w:r>
-          <w:rPr>
-            <w:noProof/>
-            <w:webHidden/>
-          </w:rPr>
-          <w:tab/>
-        </w:r>
-        <w:r>
-          <w:rPr>
-            <w:noProof/>
-            <w:webHidden/>
-          </w:rPr>
-          <w:fldChar w:fldCharType="begin"/>
-        </w:r>
-        <w:r>
-          <w:rPr>
-            <w:noProof/>
-            <w:webHidden/>
-          </w:rPr>
-          <w:instrText xml:space="preserve"> PAGEREF _Toc225706670 \h </w:instrText>
-        </w:r>
-        <w:r>
-          <w:rPr>
-            <w:noProof/>
-            <w:webHidden/>
-          </w:rPr>
-        </w:r>
-        <w:r>
-          <w:rPr>
-            <w:noProof/>
-            <w:webHidden/>
-          </w:rPr>
-          <w:fldChar w:fldCharType="separate"/>
-        </w:r>
-        <w:r>
-          <w:rPr>
-            <w:noProof/>
-            <w:webHidden/>
-          </w:rPr>
-          <w:t>23</w:t>
-        </w:r>
-        <w:r>
-          <w:rPr>
-            <w:noProof/>
-            <w:webHidden/>
-          </w:rPr>
-          <w:fldChar w:fldCharType="end"/>
-        </w:r>
-      </w:hyperlink>
-    </w:p>
-    <w:p>
-      <w:pPr>
-        <w:pStyle w:val="Banghinhminhhoa"/>
-        <w:tabs>
-          <w:tab w:val="right" w:leader="dot" w:pos="8999"/>
-        </w:tabs>
-        <w:spacing w:line="360" w:lineRule="auto"/>
-        <w:rPr>
-          <w:rFonts w:asciiTheme="minorHAnsi" w:eastAsiaTheme="minorEastAsia" w:hAnsiTheme="minorHAnsi"/>
-          <w:noProof/>
-          <w:kern w:val="2"/>
-          <w:sz w:val="24"/>
-          <w:szCs w:val="24"/>
-          <w:lang w:val="vi-VN" w:eastAsia="vi-VN"/>
-          <w14:ligatures w14:val="standardContextual"/>
-        </w:rPr>
-      </w:pPr>
-      <w:hyperlink w:anchor="_Toc225706671" w:history="1">
-        <w:r>
-          <w:rPr>
-            <w:rStyle w:val="Siuktni"/>
-            <w:noProof/>
-            <w:lang w:eastAsia="vi-VN"/>
-          </w:rPr>
-          <w:t>Hình 3.5: Code minh họa - build_index() và search_vector() với ChromaDB</w:t>
-        </w:r>
-        <w:r>
-          <w:rPr>
-            <w:noProof/>
-            <w:webHidden/>
-          </w:rPr>
-          <w:tab/>
-        </w:r>
-        <w:r>
-          <w:rPr>
-            <w:noProof/>
-            <w:webHidden/>
-          </w:rPr>
-          <w:fldChar w:fldCharType="begin"/>
-        </w:r>
-        <w:r>
-          <w:rPr>
-            <w:noProof/>
-            <w:webHidden/>
-          </w:rPr>
-          <w:instrText xml:space="preserve"> PAGEREF _Toc225706671 \h </w:instrText>
-        </w:r>
-        <w:r>
-          <w:rPr>
-            <w:noProof/>
-            <w:webHidden/>
-          </w:rPr>
-        </w:r>
-        <w:r>
-          <w:rPr>
-            <w:noProof/>
-            <w:webHidden/>
-          </w:rPr>
-          <w:fldChar w:fldCharType="separate"/>
-        </w:r>
-        <w:r>
-          <w:rPr>
-            <w:noProof/>
-            <w:webHidden/>
-          </w:rPr>
-          <w:t>24</w:t>
-        </w:r>
-        <w:r>
-          <w:rPr>
-            <w:noProof/>
-            <w:webHidden/>
-          </w:rPr>
-          <w:fldChar w:fldCharType="end"/>
-        </w:r>
-      </w:hyperlink>
-    </w:p>
-    <w:p>
-      <w:pPr>
-        <w:pStyle w:val="Banghinhminhhoa"/>
-        <w:tabs>
-          <w:tab w:val="right" w:leader="dot" w:pos="8999"/>
-        </w:tabs>
-        <w:spacing w:line="360" w:lineRule="auto"/>
-        <w:rPr>
-          <w:rFonts w:asciiTheme="minorHAnsi" w:eastAsiaTheme="minorEastAsia" w:hAnsiTheme="minorHAnsi"/>
-          <w:noProof/>
-          <w:kern w:val="2"/>
-          <w:sz w:val="24"/>
-          <w:szCs w:val="24"/>
-          <w:lang w:val="vi-VN" w:eastAsia="vi-VN"/>
-          <w14:ligatures w14:val="standardContextual"/>
-        </w:rPr>
-      </w:pPr>
-      <w:hyperlink w:anchor="_Toc225706672" w:history="1">
-        <w:r>
-          <w:rPr>
-            <w:rStyle w:val="Siuktni"/>
-            <w:noProof/>
-            <w:lang w:val="vi-VN" w:eastAsia="vi-VN"/>
-          </w:rPr>
-          <w:t>Hình 3.6: Code minh họa - Chia dữ liệu theo nhóm faq_id (GroupShuffleSplit)</w:t>
-        </w:r>
-        <w:r>
-          <w:rPr>
-            <w:noProof/>
-            <w:webHidden/>
-          </w:rPr>
-          <w:tab/>
-        </w:r>
-        <w:r>
-          <w:rPr>
-            <w:noProof/>
-            <w:webHidden/>
-          </w:rPr>
-          <w:fldChar w:fldCharType="begin"/>
-        </w:r>
-        <w:r>
-          <w:rPr>
-            <w:noProof/>
-            <w:webHidden/>
-          </w:rPr>
-          <w:instrText xml:space="preserve"> PAGEREF _Toc225706672 \h </w:instrText>
-        </w:r>
-        <w:r>
-          <w:rPr>
-            <w:noProof/>
-            <w:webHidden/>
-          </w:rPr>
-        </w:r>
-        <w:r>
-          <w:rPr>
-            <w:noProof/>
-            <w:webHidden/>
-          </w:rPr>
-          <w:fldChar w:fldCharType="separate"/>
-        </w:r>
-        <w:r>
-          <w:rPr>
-            <w:noProof/>
-            <w:webHidden/>
-          </w:rPr>
-          <w:t>25</w:t>
-        </w:r>
-        <w:r>
-          <w:rPr>
-            <w:noProof/>
-            <w:webHidden/>
-          </w:rPr>
-          <w:fldChar w:fldCharType="end"/>
-        </w:r>
-      </w:hyperlink>
-    </w:p>
-    <w:p>
-      <w:pPr>
-        <w:pStyle w:val="Banghinhminhhoa"/>
-        <w:tabs>
-          <w:tab w:val="right" w:leader="dot" w:pos="8999"/>
-        </w:tabs>
-        <w:spacing w:line="360" w:lineRule="auto"/>
-        <w:rPr>
-          <w:rFonts w:asciiTheme="minorHAnsi" w:eastAsiaTheme="minorEastAsia" w:hAnsiTheme="minorHAnsi"/>
-          <w:noProof/>
-          <w:kern w:val="2"/>
-          <w:sz w:val="24"/>
-          <w:szCs w:val="24"/>
-          <w:lang w:val="vi-VN" w:eastAsia="vi-VN"/>
-          <w14:ligatures w14:val="standardContextual"/>
-        </w:rPr>
-      </w:pPr>
-      <w:hyperlink w:anchor="_Toc225706673" w:history="1">
-        <w:r>
-          <w:rPr>
-            <w:rStyle w:val="Siuktni"/>
-            <w:noProof/>
-            <w:lang w:val="vi-VN" w:eastAsia="vi-VN"/>
-          </w:rPr>
-          <w:t>Hình 3.7: Code minh họa - Lớp FinetunedEncoder (PhoBERT + ViTokenizer)</w:t>
-        </w:r>
-        <w:r>
-          <w:rPr>
-            <w:noProof/>
-            <w:webHidden/>
-          </w:rPr>
-          <w:tab/>
-        </w:r>
-        <w:r>
-          <w:rPr>
-            <w:noProof/>
-            <w:webHidden/>
-          </w:rPr>
-          <w:fldChar w:fldCharType="begin"/>
-        </w:r>
-        <w:r>
-          <w:rPr>
-            <w:noProof/>
-            <w:webHidden/>
-          </w:rPr>
-          <w:instrText xml:space="preserve"> PAGEREF _Toc225706673 \h </w:instrText>
-        </w:r>
-        <w:r>
-          <w:rPr>
-            <w:noProof/>
-            <w:webHidden/>
-          </w:rPr>
-        </w:r>
-        <w:r>
-          <w:rPr>
-            <w:noProof/>
-            <w:webHidden/>
-          </w:rPr>
-          <w:fldChar w:fldCharType="separate"/>
-        </w:r>
-        <w:r>
-          <w:rPr>
-            <w:noProof/>
-            <w:webHidden/>
-          </w:rPr>
-          <w:t>26</w:t>
-        </w:r>
-        <w:r>
-          <w:rPr>
-            <w:noProof/>
-            <w:webHidden/>
-          </w:rPr>
-          <w:fldChar w:fldCharType="end"/>
-        </w:r>
-      </w:hyperlink>
-    </w:p>
-    <w:p>
-      <w:pPr>
-        <w:pStyle w:val="Banghinhminhhoa"/>
-        <w:tabs>
-          <w:tab w:val="right" w:leader="dot" w:pos="8999"/>
-        </w:tabs>
-        <w:spacing w:line="360" w:lineRule="auto"/>
-        <w:rPr>
-          <w:rFonts w:asciiTheme="minorHAnsi" w:eastAsiaTheme="minorEastAsia" w:hAnsiTheme="minorHAnsi"/>
-          <w:noProof/>
-          <w:kern w:val="2"/>
-          <w:sz w:val="24"/>
-          <w:szCs w:val="24"/>
-          <w:lang w:val="vi-VN" w:eastAsia="vi-VN"/>
-          <w14:ligatures w14:val="standardContextual"/>
-        </w:rPr>
-      </w:pPr>
-      <w:hyperlink w:anchor="_Toc225706674" w:history="1">
-        <w:r>
-          <w:rPr>
-            <w:rStyle w:val="Siuktni"/>
-            <w:noProof/>
-            <w:lang w:val="vi-VN" w:eastAsia="vi-VN"/>
-          </w:rPr>
-          <w:t>Hình 3.8: Công thức toán học MultipleNegativesRankingLoss và cách triển khai</w:t>
-        </w:r>
-        <w:r>
-          <w:rPr>
-            <w:noProof/>
-            <w:webHidden/>
-          </w:rPr>
-          <w:tab/>
-        </w:r>
-        <w:r>
-          <w:rPr>
-            <w:noProof/>
-            <w:webHidden/>
-          </w:rPr>
-          <w:fldChar w:fldCharType="begin"/>
-        </w:r>
-        <w:r>
-          <w:rPr>
-            <w:noProof/>
-            <w:webHidden/>
-          </w:rPr>
-          <w:instrText xml:space="preserve"> PAGEREF _Toc225706674 \h </w:instrText>
-        </w:r>
-        <w:r>
-          <w:rPr>
-            <w:noProof/>
-            <w:webHidden/>
-          </w:rPr>
-        </w:r>
-        <w:r>
-          <w:rPr>
-            <w:noProof/>
-            <w:webHidden/>
-          </w:rPr>
-          <w:fldChar w:fldCharType="separate"/>
-        </w:r>
-        <w:r>
-          <w:rPr>
-            <w:noProof/>
-            <w:webHidden/>
-          </w:rPr>
-          <w:t>27</w:t>
-        </w:r>
-        <w:r>
-          <w:rPr>
-            <w:noProof/>
-            <w:webHidden/>
-          </w:rPr>
-          <w:fldChar w:fldCharType="end"/>
-        </w:r>
-      </w:hyperlink>
-    </w:p>
-    <w:p>
-      <w:pPr>
-        <w:pStyle w:val="Banghinhminhhoa"/>
-        <w:tabs>
-          <w:tab w:val="right" w:leader="dot" w:pos="8999"/>
-        </w:tabs>
-        <w:spacing w:line="360" w:lineRule="auto"/>
-        <w:rPr>
-          <w:rFonts w:asciiTheme="minorHAnsi" w:eastAsiaTheme="minorEastAsia" w:hAnsiTheme="minorHAnsi"/>
-          <w:noProof/>
-          <w:kern w:val="2"/>
-          <w:sz w:val="24"/>
-          <w:szCs w:val="24"/>
-          <w:lang w:val="vi-VN" w:eastAsia="vi-VN"/>
-          <w14:ligatures w14:val="standardContextual"/>
-        </w:rPr>
-      </w:pPr>
-      <w:hyperlink w:anchor="_Toc225706675" w:history="1">
-        <w:r>
-          <w:rPr>
-            <w:rStyle w:val="Siuktni"/>
-            <w:noProof/>
-            <w:lang w:val="vi-VN" w:eastAsia="vi-VN"/>
-          </w:rPr>
-          <w:t>Hình 3.9: Công thức toán học LoRA và cấu hình thực tế (r=16, α=16, 0.53% tham số)</w:t>
-        </w:r>
-        <w:r>
-          <w:rPr>
-            <w:noProof/>
-            <w:webHidden/>
-          </w:rPr>
-          <w:tab/>
-        </w:r>
-        <w:r>
-          <w:rPr>
-            <w:noProof/>
-            <w:webHidden/>
-          </w:rPr>
-          <w:fldChar w:fldCharType="begin"/>
-        </w:r>
-        <w:r>
-          <w:rPr>
-            <w:noProof/>
-            <w:webHidden/>
-          </w:rPr>
-          <w:instrText xml:space="preserve"> PAGEREF _Toc225706675 \h </w:instrText>
-        </w:r>
-        <w:r>
-          <w:rPr>
-            <w:noProof/>
-            <w:webHidden/>
-          </w:rPr>
-        </w:r>
-        <w:r>
-          <w:rPr>
-            <w:noProof/>
-            <w:webHidden/>
-          </w:rPr>
-          <w:fldChar w:fldCharType="separate"/>
-        </w:r>
-        <w:r>
-          <w:rPr>
-            <w:noProof/>
-            <w:webHidden/>
-          </w:rPr>
-          <w:t>30</w:t>
-        </w:r>
-        <w:r>
-          <w:rPr>
-            <w:noProof/>
-            <w:webHidden/>
-          </w:rPr>
-          <w:fldChar w:fldCharType="end"/>
-        </w:r>
-      </w:hyperlink>
-    </w:p>
-    <w:p>
-      <w:pPr>
-        <w:pStyle w:val="Banghinhminhhoa"/>
-        <w:tabs>
-          <w:tab w:val="right" w:leader="dot" w:pos="8999"/>
-        </w:tabs>
-        <w:spacing w:line="360" w:lineRule="auto"/>
-        <w:rPr>
-          <w:rFonts w:asciiTheme="minorHAnsi" w:eastAsiaTheme="minorEastAsia" w:hAnsiTheme="minorHAnsi"/>
-          <w:noProof/>
-          <w:kern w:val="2"/>
-          <w:sz w:val="24"/>
-          <w:szCs w:val="24"/>
-          <w:lang w:val="vi-VN" w:eastAsia="vi-VN"/>
-          <w14:ligatures w14:val="standardContextual"/>
-        </w:rPr>
-      </w:pPr>
-      <w:hyperlink w:anchor="_Toc225706676" w:history="1">
-        <w:r>
-          <w:rPr>
-            <w:rStyle w:val="Siuktni"/>
-            <w:noProof/>
-            <w:lang w:val="vi-VN"/>
-          </w:rPr>
-          <w:t>Hình 4.1: Ma trận phân bố rank – Số lượng truy vấn theo vị trí FAQ đúng trong kết quả top-5</w:t>
-        </w:r>
-        <w:r>
-          <w:rPr>
-            <w:noProof/>
-            <w:webHidden/>
-          </w:rPr>
-          <w:tab/>
-        </w:r>
-        <w:r>
-          <w:rPr>
-            <w:noProof/>
-            <w:webHidden/>
-          </w:rPr>
-          <w:fldChar w:fldCharType="begin"/>
-        </w:r>
-        <w:r>
-          <w:rPr>
-            <w:noProof/>
-            <w:webHidden/>
-          </w:rPr>
-          <w:instrText xml:space="preserve"> PAGEREF _Toc225706676 \h </w:instrText>
-        </w:r>
-        <w:r>
-          <w:rPr>
-            <w:noProof/>
-            <w:webHidden/>
-          </w:rPr>
-        </w:r>
-        <w:r>
-          <w:rPr>
-            <w:noProof/>
-            <w:webHidden/>
-          </w:rPr>
-          <w:fldChar w:fldCharType="separate"/>
-        </w:r>
-        <w:r>
-          <w:rPr>
-            <w:noProof/>
-            <w:webHidden/>
-          </w:rPr>
-          <w:t>34</w:t>
-        </w:r>
-        <w:r>
-          <w:rPr>
-            <w:noProof/>
-            <w:webHidden/>
-          </w:rPr>
-          <w:fldChar w:fldCharType="end"/>
-        </w:r>
-      </w:hyperlink>
-    </w:p>
-    <w:p>
-      <w:pPr>
-        <w:pStyle w:val="Banghinhminhhoa"/>
-        <w:tabs>
-          <w:tab w:val="right" w:leader="dot" w:pos="8999"/>
-        </w:tabs>
-        <w:spacing w:line="360" w:lineRule="auto"/>
-        <w:rPr>
-          <w:rFonts w:asciiTheme="minorHAnsi" w:eastAsiaTheme="minorEastAsia" w:hAnsiTheme="minorHAnsi"/>
-          <w:noProof/>
-          <w:kern w:val="2"/>
-          <w:sz w:val="24"/>
-          <w:szCs w:val="24"/>
-          <w:lang w:val="vi-VN" w:eastAsia="vi-VN"/>
-          <w14:ligatures w14:val="standardContextual"/>
-        </w:rPr>
-      </w:pPr>
-      <w:hyperlink w:anchor="_Toc225706677" w:history="1">
-        <w:r>
-          <w:rPr>
-            <w:rStyle w:val="Siuktni"/>
-            <w:noProof/>
-            <w:lang w:val="vi-VN"/>
-          </w:rPr>
-          <w:t>Hình 4.2: Biểu đồ so sánh các tiêu chí đánh giá giữa ba phương pháp</w:t>
-        </w:r>
-        <w:r>
-          <w:rPr>
-            <w:noProof/>
-            <w:webHidden/>
-          </w:rPr>
-          <w:tab/>
-        </w:r>
-        <w:r>
-          <w:rPr>
-            <w:noProof/>
-            <w:webHidden/>
-          </w:rPr>
-          <w:fldChar w:fldCharType="begin"/>
-        </w:r>
-        <w:r>
-          <w:rPr>
-            <w:noProof/>
-            <w:webHidden/>
-          </w:rPr>
-          <w:instrText xml:space="preserve"> PAGEREF _Toc225706677 \h </w:instrText>
-        </w:r>
-        <w:r>
-          <w:rPr>
-            <w:noProof/>
-            <w:webHidden/>
-          </w:rPr>
-        </w:r>
-        <w:r>
-          <w:rPr>
-            <w:noProof/>
-            <w:webHidden/>
-          </w:rPr>
-          <w:fldChar w:fldCharType="separate"/>
-        </w:r>
-        <w:r>
-          <w:rPr>
-            <w:noProof/>
-            <w:webHidden/>
-          </w:rPr>
-          <w:t>35</w:t>
-        </w:r>
-        <w:r>
-          <w:rPr>
-            <w:noProof/>
-            <w:webHidden/>
-          </w:rPr>
-          <w:fldChar w:fldCharType="end"/>
-        </w:r>
-      </w:hyperlink>
-    </w:p>
-    <w:p>
-      <w:pPr>
-        <w:pStyle w:val="Banghinhminhhoa"/>
-        <w:tabs>
-          <w:tab w:val="right" w:leader="dot" w:pos="8999"/>
-        </w:tabs>
-        <w:spacing w:line="360" w:lineRule="auto"/>
-        <w:rPr>
-          <w:rFonts w:asciiTheme="minorHAnsi" w:eastAsiaTheme="minorEastAsia" w:hAnsiTheme="minorHAnsi"/>
-          <w:noProof/>
-          <w:kern w:val="2"/>
-          <w:sz w:val="24"/>
-          <w:szCs w:val="24"/>
-          <w:lang w:val="vi-VN" w:eastAsia="vi-VN"/>
-          <w14:ligatures w14:val="standardContextual"/>
-        </w:rPr>
-      </w:pPr>
-      <w:hyperlink w:anchor="_Toc225706678" w:history="1">
-        <w:r>
-          <w:rPr>
-            <w:rStyle w:val="Siuktni"/>
-            <w:noProof/>
-          </w:rPr>
-          <w:t>Hình 4.3: Log so sánh TF-IDF vs PhoBERT gốc</w:t>
-        </w:r>
-        <w:r>
-          <w:rPr>
-            <w:noProof/>
-            <w:webHidden/>
-          </w:rPr>
-          <w:tab/>
-        </w:r>
-        <w:r>
-          <w:rPr>
-            <w:noProof/>
-            <w:webHidden/>
-          </w:rPr>
-          <w:fldChar w:fldCharType="begin"/>
-        </w:r>
-        <w:r>
-          <w:rPr>
-            <w:noProof/>
-            <w:webHidden/>
-          </w:rPr>
-          <w:instrText xml:space="preserve"> PAGEREF _Toc225706678 \h </w:instrText>
-        </w:r>
-        <w:r>
-          <w:rPr>
-            <w:noProof/>
-            <w:webHidden/>
-          </w:rPr>
-        </w:r>
-        <w:r>
-          <w:rPr>
-            <w:noProof/>
-            <w:webHidden/>
-          </w:rPr>
-          <w:fldChar w:fldCharType="separate"/>
-        </w:r>
-        <w:r>
-          <w:rPr>
-            <w:noProof/>
-            <w:webHidden/>
-          </w:rPr>
-          <w:t>36</w:t>
-        </w:r>
-        <w:r>
-          <w:rPr>
-            <w:noProof/>
-            <w:webHidden/>
-          </w:rPr>
-          <w:fldChar w:fldCharType="end"/>
-        </w:r>
-      </w:hyperlink>
-    </w:p>
-    <w:p>
-      <w:pPr>
-        <w:pStyle w:val="Banghinhminhhoa"/>
-        <w:tabs>
-          <w:tab w:val="right" w:leader="dot" w:pos="8999"/>
-        </w:tabs>
-        <w:spacing w:line="360" w:lineRule="auto"/>
-        <w:rPr>
-          <w:rFonts w:asciiTheme="minorHAnsi" w:eastAsiaTheme="minorEastAsia" w:hAnsiTheme="minorHAnsi"/>
-          <w:noProof/>
-          <w:kern w:val="2"/>
-          <w:sz w:val="24"/>
-          <w:szCs w:val="24"/>
-          <w:lang w:val="vi-VN" w:eastAsia="vi-VN"/>
-          <w14:ligatures w14:val="standardContextual"/>
-        </w:rPr>
-      </w:pPr>
-      <w:hyperlink w:anchor="_Toc225706679" w:history="1">
-        <w:r>
-          <w:rPr>
-            <w:rStyle w:val="Siuktni"/>
-            <w:noProof/>
-          </w:rPr>
-          <w:t>Hình 4.4: Đường cong loss trong quá trình huấn luyện PhoBERT Fine-tuned</w:t>
-        </w:r>
-        <w:r>
-          <w:rPr>
-            <w:noProof/>
-            <w:webHidden/>
-          </w:rPr>
-          <w:tab/>
-        </w:r>
-        <w:r>
-          <w:rPr>
-            <w:noProof/>
-            <w:webHidden/>
-          </w:rPr>
-          <w:fldChar w:fldCharType="begin"/>
-        </w:r>
-        <w:r>
-          <w:rPr>
-            <w:noProof/>
-            <w:webHidden/>
-          </w:rPr>
-          <w:instrText xml:space="preserve"> PAGEREF _Toc225706679 \h </w:instrText>
-        </w:r>
-        <w:r>
-          <w:rPr>
-            <w:noProof/>
-            <w:webHidden/>
-          </w:rPr>
-        </w:r>
-        <w:r>
-          <w:rPr>
-            <w:noProof/>
-            <w:webHidden/>
-          </w:rPr>
-          <w:fldChar w:fldCharType="separate"/>
-        </w:r>
-        <w:r>
-          <w:rPr>
-            <w:noProof/>
-            <w:webHidden/>
-          </w:rPr>
-          <w:t>37</w:t>
-        </w:r>
-        <w:r>
-          <w:rPr>
-            <w:noProof/>
-            <w:webHidden/>
-          </w:rPr>
-          <w:fldChar w:fldCharType="end"/>
-        </w:r>
-      </w:hyperlink>
-    </w:p>
-    <w:p>
-      <w:pPr>
-        <w:pStyle w:val="Banghinhminhhoa"/>
-        <w:tabs>
-          <w:tab w:val="right" w:leader="dot" w:pos="8999"/>
-        </w:tabs>
-        <w:spacing w:line="360" w:lineRule="auto"/>
-        <w:rPr>
-          <w:rFonts w:asciiTheme="minorHAnsi" w:eastAsiaTheme="minorEastAsia" w:hAnsiTheme="minorHAnsi"/>
-          <w:noProof/>
-          <w:kern w:val="2"/>
-          <w:sz w:val="24"/>
-          <w:szCs w:val="24"/>
-          <w:lang w:val="vi-VN" w:eastAsia="vi-VN"/>
-          <w14:ligatures w14:val="standardContextual"/>
-        </w:rPr>
-      </w:pPr>
-      <w:hyperlink w:anchor="_Toc225706680" w:history="1">
-        <w:r>
-          <w:rPr>
-            <w:rStyle w:val="Siuktni"/>
-            <w:noProof/>
-            <w:lang w:val="vi-VN"/>
-          </w:rPr>
-          <w:t>Hình 4.5: Đường cong loss trong quá trình fine-tune Qwen2.5-7B với LoRA</w:t>
-        </w:r>
-        <w:r>
-          <w:rPr>
-            <w:noProof/>
-            <w:webHidden/>
-          </w:rPr>
-          <w:tab/>
-        </w:r>
-        <w:r>
-          <w:rPr>
-            <w:noProof/>
-            <w:webHidden/>
-          </w:rPr>
-          <w:fldChar w:fldCharType="begin"/>
-        </w:r>
-        <w:r>
-          <w:rPr>
-            <w:noProof/>
-            <w:webHidden/>
-          </w:rPr>
-          <w:instrText xml:space="preserve"> PAGEREF _Toc225706680 \h </w:instrText>
-        </w:r>
-        <w:r>
-          <w:rPr>
-            <w:noProof/>
-            <w:webHidden/>
-          </w:rPr>
-        </w:r>
-        <w:r>
-          <w:rPr>
-            <w:noProof/>
-            <w:webHidden/>
-          </w:rPr>
-          <w:fldChar w:fldCharType="separate"/>
-        </w:r>
-        <w:r>
-          <w:rPr>
-            <w:noProof/>
-            <w:webHidden/>
-          </w:rPr>
-          <w:t>38</w:t>
-        </w:r>
-        <w:r>
-          <w:rPr>
-            <w:noProof/>
-            <w:webHidden/>
-          </w:rPr>
-          <w:fldChar w:fldCharType="end"/>
-        </w:r>
-      </w:hyperlink>
-    </w:p>
-    <w:p>
-      <w:pPr>
-        <w:pStyle w:val="Banghinhminhhoa"/>
-        <w:tabs>
-          <w:tab w:val="right" w:leader="dot" w:pos="8999"/>
-        </w:tabs>
-        <w:spacing w:line="360" w:lineRule="auto"/>
-        <w:rPr>
-          <w:rFonts w:asciiTheme="minorHAnsi" w:eastAsiaTheme="minorEastAsia" w:hAnsiTheme="minorHAnsi"/>
-          <w:noProof/>
-          <w:kern w:val="2"/>
-          <w:sz w:val="24"/>
-          <w:szCs w:val="24"/>
-          <w:lang w:val="vi-VN" w:eastAsia="vi-VN"/>
-          <w14:ligatures w14:val="standardContextual"/>
-        </w:rPr>
-      </w:pPr>
-      <w:hyperlink w:anchor="_Toc225706681" w:history="1">
-        <w:r>
-          <w:rPr>
-            <w:rStyle w:val="Siuktni"/>
-            <w:noProof/>
-          </w:rPr>
-          <w:t>Hình 4.6: Lịch trình learning rate (warmup + cosine decay) trong quá trình fine-tune Qwen2.5-7B</w:t>
-        </w:r>
-        <w:r>
-          <w:rPr>
-            <w:noProof/>
-            <w:webHidden/>
-          </w:rPr>
-          <w:tab/>
-        </w:r>
-        <w:r>
-          <w:rPr>
-            <w:noProof/>
-            <w:webHidden/>
-          </w:rPr>
-          <w:fldChar w:fldCharType="begin"/>
-        </w:r>
-        <w:r>
-          <w:rPr>
-            <w:noProof/>
-            <w:webHidden/>
-          </w:rPr>
-          <w:instrText xml:space="preserve"> PAGEREF _Toc225706681 \h </w:instrText>
-        </w:r>
-        <w:r>
-          <w:rPr>
-            <w:noProof/>
-            <w:webHidden/>
-          </w:rPr>
-        </w:r>
-        <w:r>
-          <w:rPr>
-            <w:noProof/>
-            <w:webHidden/>
-          </w:rPr>
-          <w:fldChar w:fldCharType="separate"/>
-        </w:r>
-        <w:r>
-          <w:rPr>
-            <w:noProof/>
-            <w:webHidden/>
-          </w:rPr>
-          <w:t>39</w:t>
-        </w:r>
-        <w:r>
-          <w:rPr>
-            <w:noProof/>
-            <w:webHidden/>
-          </w:rPr>
-          <w:fldChar w:fldCharType="end"/>
-        </w:r>
-      </w:hyperlink>
-    </w:p>
-    <w:p>
-      <w:pPr>
-        <w:pStyle w:val="Banghinhminhhoa"/>
-        <w:tabs>
-          <w:tab w:val="right" w:leader="dot" w:pos="8999"/>
-        </w:tabs>
-        <w:spacing w:line="360" w:lineRule="auto"/>
-        <w:rPr>
-          <w:rFonts w:asciiTheme="minorHAnsi" w:eastAsiaTheme="minorEastAsia" w:hAnsiTheme="minorHAnsi"/>
-          <w:noProof/>
-          <w:kern w:val="2"/>
-          <w:sz w:val="24"/>
-          <w:szCs w:val="24"/>
-          <w:lang w:val="vi-VN" w:eastAsia="vi-VN"/>
-          <w14:ligatures w14:val="standardContextual"/>
-        </w:rPr>
-      </w:pPr>
-      <w:hyperlink w:anchor="_Toc225706682" w:history="1">
-        <w:r>
-          <w:rPr>
-            <w:rStyle w:val="Siuktni"/>
-            <w:noProof/>
-          </w:rPr>
-          <w:t>Hình 5.1: Giao diện chính của hệ thống</w:t>
-        </w:r>
-        <w:r>
-          <w:rPr>
-            <w:noProof/>
-            <w:webHidden/>
-          </w:rPr>
-          <w:tab/>
-        </w:r>
-        <w:r>
-          <w:rPr>
-            <w:noProof/>
-            <w:webHidden/>
-          </w:rPr>
-          <w:fldChar w:fldCharType="begin"/>
-        </w:r>
-        <w:r>
-          <w:rPr>
-            <w:noProof/>
-            <w:webHidden/>
-          </w:rPr>
-          <w:instrText xml:space="preserve"> PAGEREF _Toc225706682 \h </w:instrText>
-        </w:r>
-        <w:r>
-          <w:rPr>
-            <w:noProof/>
-            <w:webHidden/>
-          </w:rPr>
-        </w:r>
-        <w:r>
-          <w:rPr>
-            <w:noProof/>
-            <w:webHidden/>
-          </w:rPr>
-          <w:fldChar w:fldCharType="separate"/>
-        </w:r>
-        <w:r>
-          <w:rPr>
-            <w:noProof/>
-            <w:webHidden/>
-          </w:rPr>
-          <w:t>43</w:t>
-        </w:r>
-        <w:r>
-          <w:rPr>
-            <w:noProof/>
-            <w:webHidden/>
-          </w:rPr>
-          <w:fldChar w:fldCharType="end"/>
-        </w:r>
-      </w:hyperlink>
-    </w:p>
-    <w:p>
-      <w:pPr>
-        <w:pStyle w:val="Banghinhminhhoa"/>
-        <w:tabs>
-          <w:tab w:val="right" w:leader="dot" w:pos="8999"/>
-        </w:tabs>
-        <w:spacing w:line="360" w:lineRule="auto"/>
-        <w:rPr>
-          <w:rFonts w:asciiTheme="minorHAnsi" w:eastAsiaTheme="minorEastAsia" w:hAnsiTheme="minorHAnsi"/>
-          <w:noProof/>
-          <w:kern w:val="2"/>
-          <w:sz w:val="24"/>
-          <w:szCs w:val="24"/>
-          <w:lang w:val="vi-VN" w:eastAsia="vi-VN"/>
-          <w14:ligatures w14:val="standardContextual"/>
-        </w:rPr>
-      </w:pPr>
-      <w:hyperlink w:anchor="_Toc225706683" w:history="1">
-        <w:r>
-          <w:rPr>
-            <w:rStyle w:val="Siuktni"/>
-            <w:noProof/>
-            <w:lang w:val="vi-VN"/>
-          </w:rPr>
-          <w:t>Hình 5.2: Kịch bản 1 – Mode 1 (Chỉ Retrieval), câu hỏi trong phạm vi</w:t>
-        </w:r>
-        <w:r>
-          <w:rPr>
-            <w:noProof/>
-            <w:webHidden/>
-          </w:rPr>
-          <w:tab/>
-        </w:r>
-        <w:r>
-          <w:rPr>
-            <w:noProof/>
-            <w:webHidden/>
-          </w:rPr>
-          <w:fldChar w:fldCharType="begin"/>
-        </w:r>
-        <w:r>
-          <w:rPr>
-            <w:noProof/>
-            <w:webHidden/>
-          </w:rPr>
-          <w:instrText xml:space="preserve"> PAGEREF _Toc225706683 \h </w:instrText>
-        </w:r>
-        <w:r>
-          <w:rPr>
-            <w:noProof/>
-            <w:webHidden/>
-          </w:rPr>
-        </w:r>
-        <w:r>
-          <w:rPr>
-            <w:noProof/>
-            <w:webHidden/>
-          </w:rPr>
-          <w:fldChar w:fldCharType="separate"/>
-        </w:r>
-        <w:r>
-          <w:rPr>
-            <w:noProof/>
-            <w:webHidden/>
-          </w:rPr>
-          <w:t>44</w:t>
-        </w:r>
-        <w:r>
-          <w:rPr>
-            <w:noProof/>
-            <w:webHidden/>
-          </w:rPr>
-          <w:fldChar w:fldCharType="end"/>
-        </w:r>
-      </w:hyperlink>
-    </w:p>
-    <w:p>
-      <w:pPr>
-        <w:pStyle w:val="Banghinhminhhoa"/>
-        <w:tabs>
-          <w:tab w:val="right" w:leader="dot" w:pos="8999"/>
-        </w:tabs>
-        <w:spacing w:line="360" w:lineRule="auto"/>
-        <w:rPr>
-          <w:rFonts w:asciiTheme="minorHAnsi" w:eastAsiaTheme="minorEastAsia" w:hAnsiTheme="minorHAnsi"/>
-          <w:noProof/>
-          <w:kern w:val="2"/>
-          <w:sz w:val="24"/>
-          <w:szCs w:val="24"/>
-          <w:lang w:val="vi-VN" w:eastAsia="vi-VN"/>
-          <w14:ligatures w14:val="standardContextual"/>
-        </w:rPr>
-      </w:pPr>
-      <w:hyperlink w:anchor="_Toc225706684" w:history="1">
-        <w:r>
-          <w:rPr>
-            <w:rStyle w:val="Siuktni"/>
-            <w:noProof/>
-            <w:lang w:val="vi-VN"/>
-          </w:rPr>
-          <w:t>Hình 5.3: Kịch bản 2 – Mode 2 (RAG), tổng hợp từ top-K FAQ thông qua Qwen3.5:9b</w:t>
-        </w:r>
-        <w:r>
-          <w:rPr>
-            <w:noProof/>
-            <w:webHidden/>
-          </w:rPr>
-          <w:tab/>
-        </w:r>
-        <w:r>
-          <w:rPr>
-            <w:noProof/>
-            <w:webHidden/>
-          </w:rPr>
-          <w:fldChar w:fldCharType="begin"/>
-        </w:r>
-        <w:r>
-          <w:rPr>
-            <w:noProof/>
-            <w:webHidden/>
-          </w:rPr>
-          <w:instrText xml:space="preserve"> PAGEREF _Toc225706684 \h </w:instrText>
-        </w:r>
-        <w:r>
-          <w:rPr>
-            <w:noProof/>
-            <w:webHidden/>
-          </w:rPr>
-        </w:r>
-        <w:r>
-          <w:rPr>
-            <w:noProof/>
-            <w:webHidden/>
-          </w:rPr>
-          <w:fldChar w:fldCharType="separate"/>
-        </w:r>
-        <w:r>
-          <w:rPr>
-            <w:noProof/>
-            <w:webHidden/>
-          </w:rPr>
-          <w:t>45</w:t>
-        </w:r>
-        <w:r>
-          <w:rPr>
-            <w:noProof/>
-            <w:webHidden/>
-          </w:rPr>
-          <w:fldChar w:fldCharType="end"/>
-        </w:r>
-      </w:hyperlink>
-    </w:p>
-    <w:p>
-      <w:pPr>
-        <w:pStyle w:val="Banghinhminhhoa"/>
-        <w:tabs>
-          <w:tab w:val="right" w:leader="dot" w:pos="8999"/>
-        </w:tabs>
-        <w:spacing w:line="360" w:lineRule="auto"/>
-        <w:rPr>
-          <w:rFonts w:asciiTheme="minorHAnsi" w:eastAsiaTheme="minorEastAsia" w:hAnsiTheme="minorHAnsi"/>
-          <w:noProof/>
-          <w:kern w:val="2"/>
-          <w:sz w:val="24"/>
-          <w:szCs w:val="24"/>
-          <w:lang w:val="vi-VN" w:eastAsia="vi-VN"/>
-          <w14:ligatures w14:val="standardContextual"/>
-        </w:rPr>
-      </w:pPr>
-      <w:hyperlink w:anchor="_Toc225706685" w:history="1">
-        <w:r>
-          <w:rPr>
-            <w:rStyle w:val="Siuktni"/>
-            <w:noProof/>
-            <w:lang w:val="vi-VN"/>
-          </w:rPr>
-          <w:t>Hình 5.4: Kịch bản 3 – Mode 3 (Hybrid), fallback sang Qwen2.5-7B LoRA khi retrieval dưới ngưỡng</w:t>
-        </w:r>
-        <w:r>
-          <w:rPr>
-            <w:noProof/>
-            <w:webHidden/>
-          </w:rPr>
-          <w:tab/>
-        </w:r>
-        <w:r>
-          <w:rPr>
-            <w:noProof/>
-            <w:webHidden/>
-          </w:rPr>
-          <w:fldChar w:fldCharType="begin"/>
-        </w:r>
-        <w:r>
-          <w:rPr>
-            <w:noProof/>
-            <w:webHidden/>
-          </w:rPr>
-          <w:instrText xml:space="preserve"> PAGEREF _Toc225706685 \h </w:instrText>
-        </w:r>
-        <w:r>
-          <w:rPr>
-            <w:noProof/>
-            <w:webHidden/>
-          </w:rPr>
-        </w:r>
-        <w:r>
-          <w:rPr>
-            <w:noProof/>
-            <w:webHidden/>
-          </w:rPr>
-          <w:fldChar w:fldCharType="separate"/>
-        </w:r>
-        <w:r>
-          <w:rPr>
-            <w:noProof/>
-            <w:webHidden/>
-          </w:rPr>
-          <w:t>46</w:t>
-        </w:r>
-        <w:r>
-          <w:rPr>
-            <w:noProof/>
-            <w:webHidden/>
-          </w:rPr>
-          <w:fldChar w:fldCharType="end"/>
-        </w:r>
-      </w:hyperlink>
-    </w:p>
-    <w:p>
-      <w:pPr>
-        <w:pStyle w:val="Banghinhminhhoa"/>
-        <w:tabs>
-          <w:tab w:val="right" w:leader="dot" w:pos="8999"/>
-        </w:tabs>
-        <w:spacing w:line="360" w:lineRule="auto"/>
-        <w:rPr>
-          <w:rFonts w:asciiTheme="minorHAnsi" w:eastAsiaTheme="minorEastAsia" w:hAnsiTheme="minorHAnsi"/>
-          <w:noProof/>
-          <w:kern w:val="2"/>
-          <w:sz w:val="24"/>
-          <w:szCs w:val="24"/>
-          <w:lang w:val="vi-VN" w:eastAsia="vi-VN"/>
-          <w14:ligatures w14:val="standardContextual"/>
-        </w:rPr>
-      </w:pPr>
-      <w:hyperlink w:anchor="_Toc225706686" w:history="1">
-        <w:r>
-          <w:rPr>
-            <w:rStyle w:val="Siuktni"/>
-            <w:noProof/>
-            <w:lang w:val="vi-VN"/>
-          </w:rPr>
-          <w:t>Hình 5.5: Kịch bản 4 – Mode 1</w:t>
-        </w:r>
-        <w:r>
-          <w:rPr>
-            <w:noProof/>
-            <w:webHidden/>
-          </w:rPr>
-          <w:tab/>
-        </w:r>
-        <w:r>
-          <w:rPr>
-            <w:noProof/>
-            <w:webHidden/>
-          </w:rPr>
-          <w:fldChar w:fldCharType="begin"/>
-        </w:r>
-        <w:r>
-          <w:rPr>
-            <w:noProof/>
-            <w:webHidden/>
-          </w:rPr>
-          <w:instrText xml:space="preserve"> PAGEREF _Toc225706686 \h </w:instrText>
-        </w:r>
-        <w:r>
-          <w:rPr>
-            <w:noProof/>
-            <w:webHidden/>
-          </w:rPr>
-        </w:r>
-        <w:r>
-          <w:rPr>
-            <w:noProof/>
-            <w:webHidden/>
-          </w:rPr>
-          <w:fldChar w:fldCharType="separate"/>
-        </w:r>
-        <w:r>
-          <w:rPr>
-            <w:noProof/>
-            <w:webHidden/>
-          </w:rPr>
-          <w:t>47</w:t>
-        </w:r>
-        <w:r>
-          <w:rPr>
-            <w:noProof/>
-            <w:webHidden/>
-          </w:rPr>
-          <w:fldChar w:fldCharType="end"/>
-        </w:r>
-      </w:hyperlink>
-    </w:p>
-    <w:p>
-      <w:pPr>
-        <w:pStyle w:val="Banghinhminhhoa"/>
-        <w:tabs>
-          <w:tab w:val="right" w:leader="dot" w:pos="8999"/>
-        </w:tabs>
-        <w:spacing w:line="360" w:lineRule="auto"/>
-        <w:rPr>
-          <w:rFonts w:asciiTheme="minorHAnsi" w:eastAsiaTheme="minorEastAsia" w:hAnsiTheme="minorHAnsi"/>
-          <w:noProof/>
-          <w:kern w:val="2"/>
-          <w:sz w:val="24"/>
-          <w:szCs w:val="24"/>
-          <w:lang w:val="vi-VN" w:eastAsia="vi-VN"/>
-          <w14:ligatures w14:val="standardContextual"/>
-        </w:rPr>
-      </w:pPr>
-      <w:hyperlink w:anchor="_Toc225706687" w:history="1">
-        <w:r>
-          <w:rPr>
-            <w:rStyle w:val="Siuktni"/>
-            <w:noProof/>
-            <w:lang w:val="vi-VN"/>
-          </w:rPr>
-          <w:t>Hình 5.6: Kịch bản 4 – Mode 2</w:t>
-        </w:r>
-        <w:r>
-          <w:rPr>
-            <w:noProof/>
-            <w:webHidden/>
-          </w:rPr>
-          <w:tab/>
-        </w:r>
-        <w:r>
-          <w:rPr>
-            <w:noProof/>
-            <w:webHidden/>
-          </w:rPr>
-          <w:fldChar w:fldCharType="begin"/>
-        </w:r>
-        <w:r>
-          <w:rPr>
-            <w:noProof/>
-            <w:webHidden/>
-          </w:rPr>
-          <w:instrText xml:space="preserve"> PAGEREF _Toc225706687 \h </w:instrText>
-        </w:r>
-        <w:r>
-          <w:rPr>
-            <w:noProof/>
-            <w:webHidden/>
-          </w:rPr>
-        </w:r>
-        <w:r>
-          <w:rPr>
-            <w:noProof/>
-            <w:webHidden/>
-          </w:rPr>
-          <w:fldChar w:fldCharType="separate"/>
-        </w:r>
-        <w:r>
-          <w:rPr>
-            <w:noProof/>
-            <w:webHidden/>
-          </w:rPr>
-          <w:t>47</w:t>
-        </w:r>
-        <w:r>
-          <w:rPr>
-            <w:noProof/>
-            <w:webHidden/>
-          </w:rPr>
-          <w:fldChar w:fldCharType="end"/>
-        </w:r>
-      </w:hyperlink>
-    </w:p>
-    <w:p>
-      <w:pPr>
-        <w:pStyle w:val="Banghinhminhhoa"/>
-        <w:tabs>
-          <w:tab w:val="right" w:leader="dot" w:pos="8999"/>
-        </w:tabs>
-        <w:spacing w:line="360" w:lineRule="auto"/>
-        <w:rPr>
-          <w:rFonts w:asciiTheme="minorHAnsi" w:eastAsiaTheme="minorEastAsia" w:hAnsiTheme="minorHAnsi"/>
-          <w:noProof/>
-          <w:kern w:val="2"/>
-          <w:sz w:val="24"/>
-          <w:szCs w:val="24"/>
-          <w:lang w:val="vi-VN" w:eastAsia="vi-VN"/>
-          <w14:ligatures w14:val="standardContextual"/>
-        </w:rPr>
-      </w:pPr>
-      <w:hyperlink w:anchor="_Toc225706688" w:history="1">
-        <w:r>
-          <w:rPr>
-            <w:rStyle w:val="Siuktni"/>
-            <w:noProof/>
-            <w:lang w:val="vi-VN"/>
-          </w:rPr>
-          <w:t>Hình 5.7: Kịch bản 4 – Mode 3</w:t>
-        </w:r>
-        <w:r>
-          <w:rPr>
-            <w:noProof/>
-            <w:webHidden/>
-          </w:rPr>
-          <w:tab/>
-        </w:r>
-        <w:r>
-          <w:rPr>
-            <w:noProof/>
-            <w:webHidden/>
-          </w:rPr>
-          <w:fldChar w:fldCharType="begin"/>
-        </w:r>
-        <w:r>
-          <w:rPr>
-            <w:noProof/>
-            <w:webHidden/>
-          </w:rPr>
-          <w:instrText xml:space="preserve"> PAGEREF _Toc225706688 \h </w:instrText>
-        </w:r>
-        <w:r>
-          <w:rPr>
-            <w:noProof/>
-            <w:webHidden/>
-          </w:rPr>
-        </w:r>
-        <w:r>
-          <w:rPr>
-            <w:noProof/>
-            <w:webHidden/>
-          </w:rPr>
-          <w:fldChar w:fldCharType="separate"/>
-        </w:r>
-        <w:r>
-          <w:rPr>
-            <w:noProof/>
-            <w:webHidden/>
-          </w:rPr>
-          <w:t>47</w:t>
-        </w:r>
-        <w:r>
-          <w:rPr>
-            <w:noProof/>
-            <w:webHidden/>
-          </w:rPr>
-          <w:fldChar w:fldCharType="end"/>
-        </w:r>
-      </w:hyperlink>
-    </w:p>
-    <w:p>
-      <w:pPr>
-        <w:pStyle w:val="Banghinhminhhoa"/>
-        <w:tabs>
-          <w:tab w:val="right" w:leader="dot" w:pos="8999"/>
-        </w:tabs>
+    </w:p>
+    <w:p>
+      <w:pPr>
         <w:spacing w:line="360" w:lineRule="auto"/>
         <w:ind w:firstLine="0"/>
-        <w:rPr>
-          <w:rFonts w:asciiTheme="minorHAnsi" w:eastAsiaTheme="minorEastAsia" w:hAnsiTheme="minorHAnsi"/>
-          <w:noProof/>
-          <w:kern w:val="2"/>
-          <w:sz w:val="24"/>
-          <w:szCs w:val="24"/>
-          <w:lang w:val="vi-VN" w:eastAsia="vi-VN"/>
-          <w14:ligatures w14:val="standardContextual"/>
-        </w:rPr>
-      </w:pPr>
-      <w:r>
-        <w:fldChar w:fldCharType="end"/>
-      </w:r>
-      <w:r>
-        <w:fldChar w:fldCharType="begin"/>
-      </w:r>
-      <w:r>
-        <w:instrText xml:space="preserve"> TOC \h \z \t "Hình,1" \c </w:instrText>
-      </w:r>
-      <w:r>
-        <w:fldChar w:fldCharType="separate"/>
-      </w:r>
-    </w:p>
-    <w:p>
-      <w:pPr>
-        <w:spacing w:line="336" w:lineRule="auto"/>
-        <w:ind w:firstLine="0"/>
+        <w:jc w:val="left"/>
       </w:pPr>
       <w:r>
         <w:fldChar w:fldCharType="end"/>
@@ -13581,7 +13612,7 @@
       <w:bookmarkStart w:id="67" w:name="_Toc225540892"/>
       <w:bookmarkStart w:id="68" w:name="_Toc225666941"/>
       <w:bookmarkStart w:id="69" w:name="_Toc225667001"/>
-      <w:bookmarkStart w:id="70" w:name="_Toc225706666"/>
+      <w:bookmarkStart w:id="70" w:name="_Toc242025705"/>
       <w:r>
         <w:rPr>
           <w:lang w:val="vi-VN" w:eastAsia="vi-VN"/>
@@ -15503,7 +15534,7 @@
       </w:pPr>
       <w:bookmarkStart w:id="84" w:name="_Toc225666942"/>
       <w:bookmarkStart w:id="85" w:name="_Toc225667002"/>
-      <w:bookmarkStart w:id="86" w:name="_Toc225706667"/>
+      <w:bookmarkStart w:id="86" w:name="_Toc242025706"/>
       <w:r>
         <w:rPr>
           <w:lang w:val="vi-VN"/>
@@ -15771,7 +15802,7 @@
       </w:pPr>
       <w:bookmarkStart w:id="89" w:name="_Toc225666943"/>
       <w:bookmarkStart w:id="90" w:name="_Toc225667003"/>
-      <w:bookmarkStart w:id="91" w:name="_Toc225706668"/>
+      <w:bookmarkStart w:id="91" w:name="_Toc242025707"/>
       <w:r>
         <w:rPr>
           <w:lang w:val="vi-VN"/>
@@ -15917,7 +15948,7 @@
       <w:bookmarkStart w:id="96" w:name="_Toc225540893"/>
       <w:bookmarkStart w:id="97" w:name="_Toc225666944"/>
       <w:bookmarkStart w:id="98" w:name="_Toc225667004"/>
-      <w:bookmarkStart w:id="99" w:name="_Toc225706669"/>
+      <w:bookmarkStart w:id="99" w:name="_Toc242025708"/>
       <w:r>
         <w:rPr>
           <w:lang w:val="vi-VN" w:eastAsia="vi-VN"/>
@@ -15941,6 +15972,12 @@
       <w:bookmarkEnd w:id="96"/>
       <w:bookmarkEnd w:id="97"/>
       <w:bookmarkEnd w:id="98"/>
+      <w:r>
+        <w:rPr>
+          <w:lang w:val="vi-VN" w:eastAsia="vi-VN"/>
+        </w:rPr>
+        <w:t xml:space="preserve"> (ngưỡng THRESHOLD trong cài đặt thực tế là 0.6)</w:t>
+      </w:r>
       <w:bookmarkEnd w:id="99"/>
     </w:p>
     <w:p>
@@ -16151,6 +16188,7 @@
                 <w:sz w:val="26"/>
                 <w:szCs w:val="26"/>
               </w:rPr>
+              <w:lastRenderedPageBreak/>
               <w:t>function hybrid_routing(question, mode=3):</w:t>
             </w:r>
           </w:p>
@@ -16178,7 +16216,6 @@
                 <w:sz w:val="26"/>
                 <w:szCs w:val="26"/>
               </w:rPr>
-              <w:lastRenderedPageBreak/>
               <w:t xml:space="preserve">  1. q_emb ← PhoBERT_finetune.encode(question)    // Dense embedding</w:t>
             </w:r>
           </w:p>
@@ -16906,7 +16943,7 @@
       <w:bookmarkStart w:id="103" w:name="_Toc225540894"/>
       <w:bookmarkStart w:id="104" w:name="_Toc225666945"/>
       <w:bookmarkStart w:id="105" w:name="_Toc225667005"/>
-      <w:bookmarkStart w:id="106" w:name="_Toc225706670"/>
+      <w:bookmarkStart w:id="106" w:name="_Toc242025709"/>
       <w:r>
         <w:rPr>
           <w:lang w:val="vi-VN" w:eastAsia="vi-VN"/>
@@ -17007,7 +17044,7 @@
       </w:pPr>
       <w:bookmarkStart w:id="107" w:name="_Toc225666946"/>
       <w:bookmarkStart w:id="108" w:name="_Toc225667006"/>
-      <w:bookmarkStart w:id="109" w:name="_Toc225706671"/>
+      <w:bookmarkStart w:id="109" w:name="_Toc242025710"/>
       <w:r>
         <w:rPr>
           <w:lang w:eastAsia="vi-VN"/>
@@ -17208,7 +17245,7 @@
       </w:pPr>
       <w:bookmarkStart w:id="112" w:name="_Toc225666947"/>
       <w:bookmarkStart w:id="113" w:name="_Toc225667007"/>
-      <w:bookmarkStart w:id="114" w:name="_Toc225706672"/>
+      <w:bookmarkStart w:id="114" w:name="_Toc242025711"/>
       <w:r>
         <w:rPr>
           <w:lang w:val="vi-VN" w:eastAsia="vi-VN"/>
@@ -17327,7 +17364,7 @@
       </w:pPr>
       <w:bookmarkStart w:id="115" w:name="_Toc225666948"/>
       <w:bookmarkStart w:id="116" w:name="_Toc225667008"/>
-      <w:bookmarkStart w:id="117" w:name="_Toc225706673"/>
+      <w:bookmarkStart w:id="117" w:name="_Toc242025712"/>
       <w:r>
         <w:rPr>
           <w:lang w:val="vi-VN" w:eastAsia="vi-VN"/>
@@ -17997,7 +18034,7 @@
       </w:pPr>
       <w:bookmarkStart w:id="119" w:name="_Toc225666949"/>
       <w:bookmarkStart w:id="120" w:name="_Toc225667009"/>
-      <w:bookmarkStart w:id="121" w:name="_Toc225706674"/>
+      <w:bookmarkStart w:id="121" w:name="_Toc242025713"/>
       <w:r>
         <w:rPr>
           <w:lang w:val="vi-VN" w:eastAsia="vi-VN"/>
@@ -18168,7 +18205,7 @@
         <w:tblLook w:val="0000" w:firstRow="0" w:lastRow="0" w:firstColumn="0" w:lastColumn="0" w:noHBand="0" w:noVBand="0"/>
       </w:tblPr>
       <w:tblGrid>
-        <w:gridCol w:w="7513"/>
+        <w:gridCol w:w="7881"/>
       </w:tblGrid>
       <w:tr>
         <w:trPr>
@@ -18455,6 +18492,7 @@
               <w:rPr>
                 <w:sz w:val="26"/>
                 <w:szCs w:val="26"/>
+                <w:lang w:val="en-US"/>
               </w:rPr>
             </w:pPr>
             <w:r>
@@ -18463,7 +18501,25 @@
                 <w:sz w:val="26"/>
                 <w:szCs w:val="26"/>
               </w:rPr>
-              <w:t xml:space="preserve">       lora_dropout=0,</w:t>
+              <w:t xml:space="preserve">       lora_dropout=0</w:t>
+            </w:r>
+            <w:r>
+              <w:rPr>
+                <w:rFonts w:eastAsia="Courier New"/>
+                <w:sz w:val="26"/>
+                <w:szCs w:val="26"/>
+                <w:lang w:val="en-US"/>
+              </w:rPr>
+              <w:t>.</w:t>
+            </w:r>
+            <w:r>
+              <w:rPr>
+                <w:rFonts w:eastAsia="Courier New"/>
+                <w:sz w:val="26"/>
+                <w:szCs w:val="26"/>
+                <w:lang w:val="en-US"/>
+              </w:rPr>
+              <w:t>05,</w:t>
             </w:r>
           </w:p>
         </w:tc>
@@ -18706,7 +18762,7 @@
                 <w:sz w:val="26"/>
                 <w:szCs w:val="26"/>
               </w:rPr>
-              <w:t xml:space="preserve">       args=TrainingArgs(epochs=</w:t>
+              <w:t xml:space="preserve">       </w:t>
             </w:r>
             <w:r>
               <w:rPr>
@@ -18714,15 +18770,7 @@
                 <w:sz w:val="26"/>
                 <w:szCs w:val="26"/>
               </w:rPr>
-              <w:t>2</w:t>
-            </w:r>
-            <w:r>
-              <w:rPr>
-                <w:rFonts w:eastAsia="Courier New"/>
-                <w:sz w:val="26"/>
-                <w:szCs w:val="26"/>
-              </w:rPr>
-              <w:t>, batch_size=2, lr=2e-4,</w:t>
+              <w:t>args=TrainingArgs(epochs=2, batch_size=2, grad_accum=4, lr=2e-4,</w:t>
             </w:r>
           </w:p>
         </w:tc>
@@ -18739,6 +18787,7 @@
             <w:pPr>
               <w:spacing w:line="360" w:lineRule="auto"/>
               <w:rPr>
+                <w:rFonts w:eastAsia="Courier New"/>
                 <w:sz w:val="26"/>
                 <w:szCs w:val="26"/>
               </w:rPr>
@@ -18749,7 +18798,32 @@
                 <w:sz w:val="26"/>
                 <w:szCs w:val="26"/>
               </w:rPr>
-              <w:t xml:space="preserve">                        warmup_ratio=0.03, lr_scheduler=cosine)</w:t>
+              <w:t xml:space="preserve">                        </w:t>
+            </w:r>
+            <w:r>
+              <w:rPr>
+                <w:rFonts w:eastAsia="Courier New"/>
+                <w:sz w:val="26"/>
+                <w:szCs w:val="26"/>
+              </w:rPr>
+              <w:t>warmup_ratio=0.03, lr_scheduler=cosine),</w:t>
+            </w:r>
+          </w:p>
+          <w:p>
+            <w:pPr>
+              <w:spacing w:line="360" w:lineRule="auto"/>
+              <w:rPr>
+                <w:sz w:val="26"/>
+                <w:szCs w:val="26"/>
+              </w:rPr>
+            </w:pPr>
+            <w:r>
+              <w:rPr>
+                <w:rFonts w:eastAsia="Courier New"/>
+                <w:sz w:val="26"/>
+                <w:szCs w:val="26"/>
+              </w:rPr>
+              <w:t xml:space="preserve">       callbacks=[EarlyStopping(patience=7)]</w:t>
             </w:r>
           </w:p>
         </w:tc>
@@ -19023,7 +19097,7 @@
       </w:pPr>
       <w:bookmarkStart w:id="123" w:name="_Toc225666950"/>
       <w:bookmarkStart w:id="124" w:name="_Toc225667010"/>
-      <w:bookmarkStart w:id="125" w:name="_Toc225706675"/>
+      <w:bookmarkStart w:id="125" w:name="_Toc242025714"/>
       <w:r>
         <w:rPr>
           <w:lang w:val="vi-VN" w:eastAsia="vi-VN"/>
@@ -19156,8 +19230,8 @@
         <w:tblLook w:val="0000" w:firstRow="0" w:lastRow="0" w:firstColumn="0" w:lastColumn="0" w:noHBand="0" w:noVBand="0"/>
       </w:tblPr>
       <w:tblGrid>
-        <w:gridCol w:w="2804"/>
-        <w:gridCol w:w="6195"/>
+        <w:gridCol w:w="2162"/>
+        <w:gridCol w:w="6837"/>
       </w:tblGrid>
       <w:tr>
         <w:tc>
@@ -19866,7 +19940,7 @@
                 <w:sz w:val="26"/>
                 <w:szCs w:val="26"/>
               </w:rPr>
-              <w:t>r=16, lora_alpha=16, batch=2, lr=2e-4, epochs=2, scheduler=cosine</w:t>
+              <w:t>r=16, lora_alpha=16, dropout=0.05, batch=2 × grad_accum=4, lr=2e-4, tối đa 2 epoch (early stopping), scheduler=cosine</w:t>
             </w:r>
           </w:p>
         </w:tc>
@@ -19910,7 +19984,16 @@
           <w:szCs w:val="26"/>
           <w:lang w:val="vi-VN" w:eastAsia="vi-VN"/>
         </w:rPr>
-        <w:t>Về dữ liệu thực nghiệm, tập test được xây dựng theo chia nhóm FAQ: các cặp thuộc cùng một faq_id chỉ xuất hiện trong một tập duy nhất. Tập test cuối cùng gồm 1.150 cặp truy vấn, tương ứng với khoảng 10% tổng số cặp, và bao phủ các FAQ hoàn toàn không được nhìn thấy trong quá trình huấn luyện. Cách chia này đảm bảo đánh giá phản ánh đúng khả năng tổng quát hóa của mô hình trong điều kiện thực tế.</w:t>
+        <w:t xml:space="preserve">Về dữ liệu thực nghiệm, tập test được xây dựng theo chia nhóm FAQ: các cặp thuộc cùng một faq_id chỉ xuất hiện trong một tập duy nhất. Tập test cuối cùng gồm </w:t>
+      </w:r>
+      <w:r>
+        <w:rPr>
+          <w:rFonts w:eastAsia="Times New Roman" w:cs="Times New Roman"/>
+          <w:szCs w:val="26"/>
+          <w:lang w:val="vi-VN" w:eastAsia="vi-VN"/>
+        </w:rPr>
+        <w:lastRenderedPageBreak/>
+        <w:t>1.150 cặp truy vấn, tương ứng với khoảng 10% tổng số cặp, và bao phủ các FAQ hoàn toàn không được nhìn thấy trong quá trình huấn luyện. Cách chia này đảm bảo đánh giá phản ánh đúng khả năng tổng quát hóa của mô hình trong điều kiện thực tế.</w:t>
       </w:r>
     </w:p>
     <w:p>
@@ -19928,7 +20011,6 @@
         <w:rPr>
           <w:lang w:val="vi-VN"/>
         </w:rPr>
-        <w:lastRenderedPageBreak/>
         <w:t>4.2. Các tiêu chí đánh giá</w:t>
       </w:r>
       <w:bookmarkEnd w:id="132"/>
@@ -20236,6 +20318,7 @@
           <w:szCs w:val="26"/>
           <w:lang w:val="vi-VN"/>
         </w:rPr>
+        <w:lastRenderedPageBreak/>
         <w:t>Cosine Similarity trung bình (Avg Cosine Sim) được tính là giá trị trung bình của độ tương đồng cosine giữa embedding của câu paraphrase truy vấn và embedding của câu FAQ đúng (positive pair) trên toàn tập test. Chỉ số này đo mức độ "kéo gần" mà mô hình đạt được giữa các câu có cùng ý nghĩa.</w:t>
       </w:r>
     </w:p>
@@ -20274,7 +20357,6 @@
                     <w:rFonts w:ascii="Cambria Math" w:hAnsi="Cambria Math"/>
                     <w:szCs w:val="26"/>
                   </w:rPr>
-                  <w:lastRenderedPageBreak/>
                   <m:t>Avg</m:t>
                 </m:r>
                 <m:r>
@@ -20613,12 +20695,14 @@
               <w:spacing w:line="360" w:lineRule="auto"/>
               <w:rPr>
                 <w:szCs w:val="26"/>
+                <w:lang w:val="nl-NL"/>
               </w:rPr>
             </w:pPr>
             <w:r>
               <w:rPr>
                 <w:rFonts w:eastAsia="Cambria Math"/>
                 <w:szCs w:val="26"/>
+                <w:lang w:val="nl-NL"/>
               </w:rPr>
               <w:t>cos(u, v) = (u · v) / (||u|| × ||v||)    [L2-normalized vectors: cos(u,v) = u · v]</w:t>
             </w:r>
@@ -20987,6 +21071,7 @@
               <w:rPr>
                 <w:szCs w:val="26"/>
               </w:rPr>
+              <w:lastRenderedPageBreak/>
               <w:t xml:space="preserve">Cosine Similarity </w:t>
             </w:r>
           </w:p>
@@ -21208,7 +21293,6 @@
               <w:rPr>
                 <w:szCs w:val="26"/>
               </w:rPr>
-              <w:lastRenderedPageBreak/>
               <w:t>P@3</w:t>
             </w:r>
           </w:p>
@@ -22014,7 +22098,7 @@
           <w:noProof/>
         </w:rPr>
         <w:drawing>
-          <wp:inline distT="0" distB="0" distL="0" distR="0" wp14:anchorId="08FE67AB" wp14:editId="7F9A6D6A">
+          <wp:inline distT="0" distB="0" distL="0" distR="0" wp14:anchorId="08FE67AB" wp14:editId="0DE68DF2">
             <wp:extent cx="5720715" cy="2668322"/>
             <wp:effectExtent l="0" t="0" r="0" b="0"/>
             <wp:docPr id="1281964564" name="Hình ảnh 1"/>
@@ -22075,7 +22159,7 @@
       <w:bookmarkStart w:id="143" w:name="_Toc225540895"/>
       <w:bookmarkStart w:id="144" w:name="_Toc225666951"/>
       <w:bookmarkStart w:id="145" w:name="_Toc225667011"/>
-      <w:bookmarkStart w:id="146" w:name="_Toc225706676"/>
+      <w:bookmarkStart w:id="146" w:name="_Toc242025715"/>
       <w:r>
         <w:rPr>
           <w:lang w:val="vi-VN"/>
@@ -22104,7 +22188,7 @@
         </w:rPr>
         <w:lastRenderedPageBreak/>
         <w:drawing>
-          <wp:inline distT="0" distB="0" distL="0" distR="0" wp14:anchorId="63DD6498" wp14:editId="39F17821">
+          <wp:inline distT="0" distB="0" distL="0" distR="0" wp14:anchorId="63DD6498" wp14:editId="0DCD0932">
             <wp:extent cx="5720715" cy="3154560"/>
             <wp:effectExtent l="0" t="0" r="0" b="8255"/>
             <wp:docPr id="32413335" name="Hình ảnh 2"/>
@@ -22165,7 +22249,7 @@
       <w:bookmarkStart w:id="149" w:name="_Toc225540896"/>
       <w:bookmarkStart w:id="150" w:name="_Toc225666952"/>
       <w:bookmarkStart w:id="151" w:name="_Toc225667012"/>
-      <w:bookmarkStart w:id="152" w:name="_Toc225706677"/>
+      <w:bookmarkStart w:id="152" w:name="_Toc242025716"/>
       <w:r>
         <w:rPr>
           <w:lang w:val="vi-VN"/>
@@ -22335,7 +22419,7 @@
       <w:bookmarkStart w:id="155" w:name="_Toc225540897"/>
       <w:bookmarkStart w:id="156" w:name="_Toc225666953"/>
       <w:bookmarkStart w:id="157" w:name="_Toc225667013"/>
-      <w:bookmarkStart w:id="158" w:name="_Toc225706678"/>
+      <w:bookmarkStart w:id="158" w:name="_Toc242025717"/>
       <w:r>
         <w:t xml:space="preserve">Hình 4.3: Log so sánh </w:t>
       </w:r>
@@ -22472,7 +22556,7 @@
         </w:rPr>
         <w:lastRenderedPageBreak/>
         <w:drawing>
-          <wp:inline distT="0" distB="0" distL="0" distR="0" wp14:anchorId="20F3BC35" wp14:editId="75257B20">
+          <wp:inline distT="0" distB="0" distL="0" distR="0" wp14:anchorId="20F3BC35" wp14:editId="37B74B35">
             <wp:extent cx="5720715" cy="2904819"/>
             <wp:effectExtent l="0" t="0" r="0" b="0"/>
             <wp:docPr id="1417352386" name="Hình ảnh 3"/>
@@ -22530,7 +22614,7 @@
       <w:bookmarkStart w:id="161" w:name="_Toc225540898"/>
       <w:bookmarkStart w:id="162" w:name="_Toc225666954"/>
       <w:bookmarkStart w:id="163" w:name="_Toc225667014"/>
-      <w:bookmarkStart w:id="164" w:name="_Toc225706679"/>
+      <w:bookmarkStart w:id="164" w:name="_Toc242025718"/>
       <w:r>
         <w:t>Hình 4.</w:t>
       </w:r>
@@ -22964,8 +23048,9 @@
               <w:rPr>
                 <w:sz w:val="26"/>
                 <w:szCs w:val="26"/>
-              </w:rPr>
-              <w:t>2 × gradient_accumulation_steps = 2</w:t>
+                <w:lang w:val="en-US"/>
+              </w:rPr>
+              <w:t>2 × gradient_accumulation_steps (4) = 8</w:t>
             </w:r>
           </w:p>
         </w:tc>
@@ -23008,8 +23093,9 @@
               <w:rPr>
                 <w:sz w:val="26"/>
                 <w:szCs w:val="26"/>
-              </w:rPr>
-              <w:t>2</w:t>
+                <w:lang w:val="en-US"/>
+              </w:rPr>
+              <w:t>Tối đa 2 (dừng sớm ở ~0,76 epoch nhờ early stopping)</w:t>
             </w:r>
           </w:p>
         </w:tc>
@@ -23185,8 +23271,9 @@
               <w:rPr>
                 <w:sz w:val="26"/>
                 <w:szCs w:val="26"/>
-              </w:rPr>
-              <w:t>~800 steps</w:t>
+                <w:lang w:val="en-US"/>
+              </w:rPr>
+              <w:t>1.000 / 2.618 dự kiến (early stopping, patience = 7); checkpoint tốt nhất ở step 300</w:t>
             </w:r>
           </w:p>
         </w:tc>
@@ -23283,7 +23370,7 @@
       <w:bookmarkStart w:id="172" w:name="_Toc225540899"/>
       <w:bookmarkStart w:id="173" w:name="_Toc225666955"/>
       <w:bookmarkStart w:id="174" w:name="_Toc225667015"/>
-      <w:bookmarkStart w:id="175" w:name="_Toc225706680"/>
+      <w:bookmarkStart w:id="175" w:name="_Toc242025719"/>
       <w:r>
         <w:rPr>
           <w:lang w:val="vi-VN"/>
@@ -23303,25 +23390,14 @@
         <w:ind w:firstLine="720"/>
         <w:rPr>
           <w:szCs w:val="26"/>
-        </w:rPr>
-      </w:pPr>
-      <w:r>
-        <w:rPr>
-          <w:szCs w:val="26"/>
-        </w:rPr>
-        <w:t>Hình 4.</w:t>
-      </w:r>
-      <w:r>
-        <w:rPr>
-          <w:szCs w:val="26"/>
-        </w:rPr>
-        <w:t>5</w:t>
-      </w:r>
-      <w:r>
-        <w:rPr>
-          <w:szCs w:val="26"/>
-        </w:rPr>
-        <w:t xml:space="preserve"> trình bày đường cong loss của Qwen2.5-7B trong khoảng 800 steps. Train loss giảm mạnh từ ~4.1 tại bước đầu tiên xuống ~1.0 ở khoảng step 100, phản ánh quá trình mô hình thích nghi nhanh với định dạng instruction-following của tập FAQ. Sau step 100, train loss tiếp tục giảm đều và ổn định quanh 0.5–0.6 ở cuối epoch. Validation loss dao động ổn định trong dải 1.0–1.05 sau step 100 và không tăng trong suốt quá trình huấn luyện, xác nhận mô hình không bị overfitting mặc dù tập dữ liệu tương đối nhỏ so với kích thước mô hình 7B.</w:t>
+          <w:lang w:val="vi-VN"/>
+        </w:rPr>
+      </w:pPr>
+      <w:r>
+        <w:rPr>
+          <w:szCs w:val="26"/>
+        </w:rPr>
+        <w:t>Hình 4.5 trình bày đường cong loss của Qwen2.5-7B trong 800 steps đầu. Train loss giảm nhanh từ ~4.1 xuống ~1.0 sau khoảng 100 steps và tiếp tục giảm về ~0.5. Validation loss thấp nhất là 1.011 tại step 300, sau đó tăng nhẹ, cho thấy mô hình bắt đầu overfit. Vì vậy early stopping dừng huấn luyện ở step 1.000 (~0,76 epoch) và giữ lại checkpoint tại step 300.</w:t>
       </w:r>
     </w:p>
     <w:p>
@@ -23330,37 +23406,22 @@
         <w:ind w:firstLine="720"/>
         <w:rPr>
           <w:szCs w:val="26"/>
-        </w:rPr>
-      </w:pPr>
-      <w:r>
-        <w:rPr>
-          <w:szCs w:val="26"/>
-        </w:rPr>
-        <w:t>Hình 4.</w:t>
-      </w:r>
-      <w:r>
-        <w:rPr>
-          <w:szCs w:val="26"/>
-        </w:rPr>
-        <w:t>6</w:t>
-      </w:r>
-      <w:r>
-        <w:rPr>
-          <w:szCs w:val="26"/>
-        </w:rPr>
-        <w:t xml:space="preserve"> cho thấy lịch trình learning rate theo chiến lược warmup + cosine decay: learning rate tăng tuyến tính từ ~2.5e-5 lên 2e-4 trong khoảng </w:t>
-      </w:r>
-      <w:r>
-        <w:rPr>
-          <w:szCs w:val="26"/>
-        </w:rPr>
-        <w:t>78</w:t>
-      </w:r>
-      <w:r>
-        <w:rPr>
-          <w:szCs w:val="26"/>
-        </w:rPr>
-        <w:t xml:space="preserve"> steps đầu (warmup ~3% tổng steps), sau đó giảm dần theo hàm cosine xuống ~1.65e-4 ở cuối quá trình huấn luyện. Lịch trình này giúp tránh bất ổn định tối ưu (optimization instability) ở các bước đầu và đảm bảo hội</w:t>
+          <w:lang w:val="vi-VN"/>
+        </w:rPr>
+      </w:pPr>
+      <w:r>
+        <w:rPr>
+          <w:szCs w:val="26"/>
+          <w:lang w:val="vi-VN"/>
+        </w:rPr>
+        <w:t xml:space="preserve">Hình 4.6 cho thấy lịch trình learning rate theo chiến lược warmup + cosine decay: learning rate tăng tuyến tính từ ~2.5e-5 lên 2e-4 trong khoảng 78 steps đầu (warmup ~3% tổng steps), sau đó giảm dần theo hàm cosine xuống ~1.65e-4 ở cuối quá trình huấn luyện. </w:t>
+      </w:r>
+      <w:r>
+        <w:rPr>
+          <w:szCs w:val="26"/>
+          <w:lang w:val="vi-VN"/>
+        </w:rPr>
+        <w:t>Lịch trình này giúp tránh bất ổn định tối ưu (optimization instability) ở các bước đầu và đảm bảo hội</w:t>
       </w:r>
       <w:r>
         <w:rPr>
@@ -23372,6 +23433,7 @@
       <w:r>
         <w:rPr>
           <w:szCs w:val="26"/>
+          <w:lang w:val="vi-VN"/>
         </w:rPr>
         <w:t>.</w:t>
       </w:r>
@@ -23449,7 +23511,7 @@
       <w:bookmarkStart w:id="178" w:name="_Toc225540900"/>
       <w:bookmarkStart w:id="179" w:name="_Toc225666956"/>
       <w:bookmarkStart w:id="180" w:name="_Toc225667016"/>
-      <w:bookmarkStart w:id="181" w:name="_Toc225706681"/>
+      <w:bookmarkStart w:id="181" w:name="_Toc242025720"/>
       <w:r>
         <w:t>Hình 4.</w:t>
       </w:r>
@@ -23923,7 +23985,14 @@
           <w:rFonts w:eastAsia="Times New Roman" w:cs="Times New Roman"/>
           <w:szCs w:val="26"/>
         </w:rPr>
-        <w:t xml:space="preserve">Mô hình đạt eval_loss = 0,9883 trên tập test, sát với giá trị validation loss tốt nhất (1,011) và thấp hơn giá trị validation loss tại checkpoint cuối (1,078). </w:t>
+        <w:t>Mô hình (checkpoint tốt nhất tại step 300) đạt eval_loss = 0,9883 trên tập test</w:t>
+      </w:r>
+      <w:r>
+        <w:rPr>
+          <w:rFonts w:eastAsia="Times New Roman" w:cs="Times New Roman"/>
+          <w:szCs w:val="26"/>
+        </w:rPr>
+        <w:t xml:space="preserve">, sát với giá trị validation loss tốt nhất (1,011) và thấp hơn giá trị validation loss tại checkpoint cuối (1,078). </w:t>
       </w:r>
       <w:r>
         <w:rPr>
@@ -24585,70 +24654,21 @@
         <w:spacing w:line="360" w:lineRule="auto"/>
         <w:ind w:firstLine="0"/>
         <w:rPr>
-          <w:lang w:val="vi-VN" w:eastAsia="vi-VN"/>
-        </w:rPr>
-      </w:pPr>
-      <w:r>
-        <w:rPr>
-          <w:szCs w:val="26"/>
-        </w:rPr>
-        <w:t>Lưu ý: Tất cả 45 trường hợp thất bại đều có FAQ đúng nằm trong top-5, không có trường hợp nào hoàn toàn bỏ sót. Điều này có nghĩa là</w:t>
-      </w:r>
-      <w:r>
-        <w:rPr>
-          <w:szCs w:val="26"/>
-        </w:rPr>
-        <w:t xml:space="preserve"> </w:t>
-      </w:r>
-      <w:r>
-        <w:rPr>
-          <w:szCs w:val="26"/>
-        </w:rPr>
-        <w:t xml:space="preserve">P@5 = 99.30% – hệ thống vẫn </w:t>
+          <w:lang w:eastAsia="vi-VN"/>
+        </w:rPr>
+      </w:pPr>
+      <w:r>
+        <w:rPr>
+          <w:szCs w:val="26"/>
+        </w:rPr>
+        <w:t xml:space="preserve">Lưu ý: Trong 45 trường hợp thất bại, 37 trường hợp vẫn có FAQ đúng nằm trong top-5 (rank 2–5), chỉ 8 trường hợp (0,7%) không xuất hiện trong top-5. Vì vậy P@5 đạt 99,30%. Trong chế độ RAG, toàn bộ top-5 được đưa vào context nên 37 trường hợp </w:t>
       </w:r>
       <w:r>
         <w:rPr>
           <w:szCs w:val="26"/>
         </w:rPr>
         <w:lastRenderedPageBreak/>
-        <w:t>tìm thấy câu đúng, chỉ chưa xếp ở vị trí số 1.</w:t>
-      </w:r>
-      <w:r>
-        <w:rPr>
-          <w:szCs w:val="26"/>
-        </w:rPr>
-        <w:t xml:space="preserve"> </w:t>
-      </w:r>
-      <w:r>
-        <w:rPr>
-          <w:szCs w:val="26"/>
-        </w:rPr>
-        <w:t>Trong chế độ RAG, toàn bộ top-5 được đưa vào context nên các trường</w:t>
-      </w:r>
-      <w:r>
-        <w:rPr>
-          <w:szCs w:val="26"/>
-        </w:rPr>
-        <w:t xml:space="preserve"> </w:t>
-      </w:r>
-      <w:r>
-        <w:rPr>
-          <w:szCs w:val="26"/>
-        </w:rPr>
-        <w:t xml:space="preserve">hợp này vẫn được xử lý đúng ở tầng sinh câu trả </w:t>
-      </w:r>
-      <w:r>
-        <w:rPr>
-          <w:szCs w:val="26"/>
-        </w:rPr>
-        <w:t>lời</w:t>
-      </w:r>
-      <w:r>
-        <w:rPr>
-          <w:szCs w:val="26"/>
-          <w:lang w:val="vi-VN"/>
-        </w:rPr>
-        <w:t>.</w:t>
+        <w:t>này vẫn có thể được trả lời đúng ở tầng sinh câu trả lời; 8 trường hợp còn lại cần được cải thiện ở tầng truy xuất.</w:t>
       </w:r>
     </w:p>
     <w:p>
@@ -24829,6 +24849,46 @@
           <w:lang w:val="vi-VN"/>
         </w:rPr>
         <w:t>Đánh giá định tính cho thấy mô hình có khả năng sinh câu trả lời tiếng Việt lưu loát và đúng ngữ pháp. Tuy nhiên, mức độ bám sát vào nội dung FAQ HCMUTE cụ thể chỉ đạt mức tạm chấp nhận: mô hình đôi khi sinh ra câu trả lời chung chung dựa trên kiến thức tiền huấn luyện thay vì khai thác trực tiếp thông tin từ ngữ cảnh FAQ được cung cấp.</w:t>
+      </w:r>
+    </w:p>
+    <w:p>
+      <w:pPr>
+        <w:spacing w:line="360" w:lineRule="auto"/>
+        <w:rPr>
+          <w:rFonts w:eastAsia="Times New Roman" w:cs="Times New Roman"/>
+          <w:i/>
+          <w:iCs/>
+          <w:szCs w:val="26"/>
+          <w:lang w:val="vi-VN"/>
+        </w:rPr>
+      </w:pPr>
+      <w:r>
+        <w:rPr>
+          <w:rFonts w:eastAsia="Times New Roman" w:cs="Times New Roman"/>
+          <w:i/>
+          <w:iCs/>
+          <w:szCs w:val="26"/>
+          <w:lang w:val="vi-VN"/>
+        </w:rPr>
+        <w:t>Mode 3 chưa có cơ chế từ chối ở nhánh sinh.</w:t>
+      </w:r>
+    </w:p>
+    <w:p>
+      <w:pPr>
+        <w:spacing w:line="360" w:lineRule="auto"/>
+        <w:rPr>
+          <w:rFonts w:eastAsia="Times New Roman" w:cs="Times New Roman"/>
+          <w:szCs w:val="26"/>
+          <w:lang w:val="vi-VN"/>
+        </w:rPr>
+      </w:pPr>
+      <w:r>
+        <w:rPr>
+          <w:rFonts w:eastAsia="Times New Roman" w:cs="Times New Roman"/>
+          <w:szCs w:val="26"/>
+          <w:lang w:val="vi-VN"/>
+        </w:rPr>
+        <w:t>Khi điểm truy xuất thấp hơn ngưỡng, Mode 3 luôn chuyển sang Qwen2.5-7B LoRA mà không kiểm tra câu hỏi có thuộc phạm vi FAQ hay không. Với câu hỏi ngoài phạm vi, mô hình có thể sinh ra câu trả lời không có căn cứ (Kịch bản 4, Hình 5.7).</w:t>
       </w:r>
     </w:p>
     <w:p>
@@ -25561,7 +25621,7 @@
       <w:bookmarkStart w:id="204" w:name="_Toc225540901"/>
       <w:bookmarkStart w:id="205" w:name="_Toc225666957"/>
       <w:bookmarkStart w:id="206" w:name="_Toc225667017"/>
-      <w:bookmarkStart w:id="207" w:name="_Toc225706682"/>
+      <w:bookmarkStart w:id="207" w:name="_Toc242025721"/>
       <w:r>
         <w:t>Hình 5.</w:t>
       </w:r>
@@ -25863,7 +25923,7 @@
       <w:bookmarkStart w:id="211" w:name="_Toc225540902"/>
       <w:bookmarkStart w:id="212" w:name="_Toc225666958"/>
       <w:bookmarkStart w:id="213" w:name="_Toc225667018"/>
-      <w:bookmarkStart w:id="214" w:name="_Toc225706683"/>
+      <w:bookmarkStart w:id="214" w:name="_Toc242025722"/>
       <w:r>
         <w:rPr>
           <w:lang w:val="vi-VN"/>
@@ -26065,7 +26125,7 @@
       <w:bookmarkStart w:id="217" w:name="_Toc225540903"/>
       <w:bookmarkStart w:id="218" w:name="_Toc225666959"/>
       <w:bookmarkStart w:id="219" w:name="_Toc225667019"/>
-      <w:bookmarkStart w:id="220" w:name="_Toc225706684"/>
+      <w:bookmarkStart w:id="220" w:name="_Toc242025723"/>
       <w:r>
         <w:rPr>
           <w:lang w:val="vi-VN"/>
@@ -26232,7 +26292,17 @@
           <w:szCs w:val="32"/>
           <w:lang w:val="vi-VN"/>
         </w:rPr>
-        <w:t>Câu hỏi sử dụng cách diễn đạt khác với từ vựng trong FAQ gốc. Trong trường hợp này, best_score có thể nằm dưới ngưỡng THRESHOLD do khoảng cách từ vựng. Mode 3 (Hybrid) xử lý tình huống này hiệu quả: khi retrieval không tự tin, hệ thống tự động chuyển sang mô hình Qwen2.5-7B LoRA fine-tuned để sinh câu trả lời dựa trên kiến thức đã học từ tập FAQ HCMUTE, mà không cần context bổ sung. Cờ out_of_scope = false được giữ nếu mô hình sinh trả lời thành công, nhờ đó người dùng không bị thông báo lỗi không cần thiết.</w:t>
+        <w:t xml:space="preserve">Câu hỏi sử dụng cách diễn đạt khác với từ vựng trong FAQ gốc. Trong trường hợp này, best_score có thể nằm dưới ngưỡng THRESHOLD do khoảng cách từ vựng. </w:t>
+      </w:r>
+      <w:r>
+        <w:rPr>
+          <w:rFonts w:eastAsiaTheme="majorEastAsia" w:cstheme="majorBidi"/>
+          <w:bCs/>
+          <w:color w:val="000000" w:themeColor="text1"/>
+          <w:szCs w:val="32"/>
+          <w:lang w:val="vi-VN"/>
+        </w:rPr>
+        <w:t>Khi đó Mode 3 (Hybrid) chuyển sang mô hình Qwen2.5-7B LoRA fine-tuned để sinh câu trả lời dựa trên kiến thức đã học từ tập FAQ HCMUTE, không có context bổ sung. Ở ví dụ này, mô hình trả lời đúng tên hiệu trưởng nhưng ghi sai học hàm ("Tiến sĩ" thay vì "PGS.TS." như trong FAQ). Điều này cho thấy khi không có context, mô hình sinh có thể sai ở các chi tiết cụ thể.</w:t>
       </w:r>
     </w:p>
     <w:p>
@@ -26306,7 +26376,7 @@
       <w:bookmarkStart w:id="223" w:name="_Toc225540904"/>
       <w:bookmarkStart w:id="224" w:name="_Toc225666960"/>
       <w:bookmarkStart w:id="225" w:name="_Toc225667020"/>
-      <w:bookmarkStart w:id="226" w:name="_Toc225706685"/>
+      <w:bookmarkStart w:id="226" w:name="_Toc242025724"/>
       <w:r>
         <w:rPr>
           <w:lang w:val="vi-VN"/>
@@ -26472,7 +26542,7 @@
       <w:bookmarkStart w:id="229" w:name="_Toc225540905"/>
       <w:bookmarkStart w:id="230" w:name="_Toc225666961"/>
       <w:bookmarkStart w:id="231" w:name="_Toc225667021"/>
-      <w:bookmarkStart w:id="232" w:name="_Toc225706686"/>
+      <w:bookmarkStart w:id="232" w:name="_Toc242025725"/>
       <w:r>
         <w:rPr>
           <w:lang w:val="vi-VN"/>
@@ -26575,7 +26645,7 @@
       <w:bookmarkStart w:id="235" w:name="_Toc225540906"/>
       <w:bookmarkStart w:id="236" w:name="_Toc225666962"/>
       <w:bookmarkStart w:id="237" w:name="_Toc225667022"/>
-      <w:bookmarkStart w:id="238" w:name="_Toc225706687"/>
+      <w:bookmarkStart w:id="238" w:name="_Toc242025726"/>
       <w:r>
         <w:rPr>
           <w:lang w:val="vi-VN"/>
@@ -26668,16 +26738,13 @@
     <w:p>
       <w:pPr>
         <w:pStyle w:val="Hnh"/>
-        <w:rPr>
-          <w:lang w:val="vi-VN"/>
-        </w:rPr>
       </w:pPr>
       <w:bookmarkStart w:id="239" w:name="_Toc225509978"/>
       <w:bookmarkStart w:id="240" w:name="_Toc225510098"/>
       <w:bookmarkStart w:id="241" w:name="_Toc225540907"/>
       <w:bookmarkStart w:id="242" w:name="_Toc225666963"/>
       <w:bookmarkStart w:id="243" w:name="_Toc225667023"/>
-      <w:bookmarkStart w:id="244" w:name="_Toc225706688"/>
+      <w:bookmarkStart w:id="244" w:name="_Toc242025727"/>
       <w:r>
         <w:rPr>
           <w:lang w:val="vi-VN"/>
@@ -26702,15 +26769,42 @@
         </w:rPr>
         <w:t>Mode 3</w:t>
       </w:r>
+      <w:bookmarkStart w:id="245" w:name="_Toc225719299"/>
       <w:bookmarkEnd w:id="239"/>
       <w:bookmarkEnd w:id="240"/>
       <w:bookmarkEnd w:id="241"/>
       <w:bookmarkEnd w:id="242"/>
       <w:bookmarkEnd w:id="243"/>
       <w:bookmarkEnd w:id="244"/>
-      <w:r>
-        <w:rPr>
-          <w:bCs/>
+    </w:p>
+    <w:p>
+      <w:pPr>
+        <w:spacing w:line="360" w:lineRule="auto"/>
+        <w:ind w:firstLine="720"/>
+        <w:rPr>
+          <w:b/>
+          <w:lang w:val="vi-VN"/>
+        </w:rPr>
+      </w:pPr>
+      <w:r>
+        <w:rPr>
+          <w:lang w:val="vi-VN"/>
+        </w:rPr>
+        <w:t>Kết quả ở ba chế độ khác nhau. Mode 1 và Mode 2 đều từ chối đúng. Ở Mode 3, câu hỏi có best_score = 0,471, thấp hơn ngưỡng nên hệ thống chuyển sang Qwen2.5-7B LoRA. Vì nhánh sinh này không có bước kiểm tra phạm vi, mô hình đã tự sinh ra một dự báo thời tiết không có căn cứ. Đây là hạn chế của Mode 3 trong phiên bản hiện tại. Có thể khắc phục bằng cách thêm một ngưỡng thấp hơn để từ chối hẳn các câu hỏi có điểm quá thấp trước khi gọi mô hình sinh.</w:t>
+      </w:r>
+    </w:p>
+    <w:p>
+      <w:pPr>
+        <w:rPr>
+          <w:rFonts w:eastAsiaTheme="majorEastAsia" w:cstheme="majorBidi"/>
+          <w:b/>
+          <w:color w:val="000000" w:themeColor="text1"/>
+          <w:szCs w:val="32"/>
+          <w:lang w:val="vi-VN"/>
+        </w:rPr>
+      </w:pPr>
+      <w:r>
+        <w:rPr>
           <w:lang w:val="vi-VN"/>
         </w:rPr>
         <w:br w:type="page"/>
@@ -26725,7 +26819,6 @@
           <w:lang w:val="vi-VN"/>
         </w:rPr>
       </w:pPr>
-      <w:bookmarkStart w:id="245" w:name="_Toc225719299"/>
       <w:r>
         <w:rPr>
           <w:lang w:val="vi-VN"/>
@@ -26856,7 +26949,13 @@
         <w:rPr>
           <w:lang w:val="vi-VN"/>
         </w:rPr>
-        <w:t xml:space="preserve"> một yêu cầu thiết yếu đối với hệ thống hỏi đáp tự động trong thực tế. Điều này được kiểm chứng qua việc tất cả 45 trường hợp lỗi của PhoBERT đều có câu trả lời đúng nằm trong top-5, đồng nghĩa với việc hệ thống không bỏ sót thông tin liên quan ngay cả trong các tình huống khó nhất.</w:t>
+        <w:t xml:space="preserve"> một yêu cầu thiết yếu đối với hệ thống hỏi đáp tự động trong thực tế. </w:t>
+      </w:r>
+      <w:r>
+        <w:rPr>
+          <w:lang w:val="vi-VN"/>
+        </w:rPr>
+        <w:t>Điều này thể hiện qua việc trong 45 trường hợp lỗi của PhoBERT, 37 trường hợp vẫn có câu trả lời đúng nằm trong top-5 (P@5 = 99,30%), chỉ 8 trường hợp bị bỏ sót hoàn toàn.</w:t>
       </w:r>
     </w:p>
     <w:p>
@@ -26895,7 +26994,13 @@
         <w:rPr>
           <w:lang w:val="vi-VN"/>
         </w:rPr>
-        <w:t xml:space="preserve"> cho thấy chiến lược huấn luyện được thiết kế hợp lý và hiệu quả. Mô hình PhoBERT fine-tuned với contrastive learning trên tập paraphrase ~10.000 mẫu đã hội tụ tốt, không có dấu hiệu overfitting nghiêm trọng khi eval loss ổn định quanh 0,195–0,200. Tương tự, mô hình Qwen2.5-7B được tinh chỉnh hiệu quả tham số bằng LoRA (chỉ 0,53% tham số được cập nhật) nhưng vẫn đạt validation loss ổn định trong dải 1,0–1,05 suốt toàn bộ quá trình huấn luyện.</w:t>
+        <w:t xml:space="preserve"> cho thấy chiến lược huấn luyện được thiết kế hợp lý và hiệu quả. Mô hình PhoBERT fine-tuned với contrastive learning trên tập paraphrase ~10.000 mẫu đã hội tụ tốt, không có dấu hiệu overfitting nghiêm trọng khi eval loss ổn định quanh 0,195–0,200. Tương tự, mô hình Qwen2.5-7B được tinh chỉnh hiệu quả tham số bằng LoRA (chỉ 0,53% tham số được cập nhật) </w:t>
+      </w:r>
+      <w:r>
+        <w:rPr>
+          <w:lang w:val="vi-VN"/>
+        </w:rPr>
+        <w:t>và đạt validation loss thấp nhất 1,011 tại step 300; khi validation loss bắt đầu tăng, cơ chế early stopping đã dừng huấn luyện và giữ lại checkpoint tốt nhất.</w:t>
       </w:r>
     </w:p>
     <w:p>
@@ -27015,6 +27120,18 @@
         </w:rPr>
         <w:t>.</w:t>
       </w:r>
+      <w:r>
+        <w:rPr>
+          <w:lang w:val="vi-VN"/>
+        </w:rPr>
+        <w:t xml:space="preserve"> </w:t>
+      </w:r>
+      <w:r>
+        <w:rPr>
+          <w:lang w:val="vi-VN"/>
+        </w:rPr>
+        <w:t>Bên cạnh đó, ở Mode 3, khi câu hỏi nằm ngoài phạm vi và điểm truy xuất thấp, mô hình sinh có thể tạo ra thông tin không có căn cứ thay vì từ chối trả lời, như đã thấy ở Kịch bản 4.</w:t>
+      </w:r>
     </w:p>
     <w:p>
       <w:pPr>
@@ -27064,7 +27181,14 @@
         <w:rPr>
           <w:lang w:val="vi-VN"/>
         </w:rPr>
-        <w:t>Về khía cạnh kỹ thuật, pipeline RAG có thể được cải tiến theo nhiều hướng: áp dụng kỹ thuật re-ranking để tối ưu hóa thứ tự trả về của ChromaDB, sử dụng chiến lược context compression để chỉ đưa vào prompt những đoạn thông tin thực sự liên quan, hoặc tích hợp các cơ chế kiểm soát hallucination để buộc mô hình sinh bám sát nội dung FAQ được cung cấp. Ngoài ra, việc thử nghiệm với các mô hình nền mạnh hơn (chẳng hạn Qwen2.5-14B hoặc các mô hình tiếng Việt chuyên biệt) cùng kỹ thuật fine-tune đầy đủ tham số trên cơ sở hạ tầng đám mây sẽ mở ra không gian cải thiện đáng kể về chất lượng sinh câu trả lời.</w:t>
+        <w:t xml:space="preserve">Về khía cạnh kỹ thuật, pipeline RAG có thể được cải tiến theo nhiều hướng: áp dụng kỹ thuật re-ranking để tối ưu hóa thứ tự trả về của ChromaDB, sử dụng chiến lược context compression để chỉ đưa vào prompt những đoạn thông tin thực sự liên quan, hoặc tích hợp các cơ chế kiểm soát hallucination để buộc mô hình sinh bám sát nội dung FAQ được cung cấp. Ngoài ra, việc thử nghiệm với các mô hình nền mạnh hơn (chẳng hạn Qwen2.5-14B hoặc các mô hình tiếng Việt chuyên biệt) cùng kỹ thuật fine-tune </w:t>
+      </w:r>
+      <w:r>
+        <w:rPr>
+          <w:lang w:val="vi-VN"/>
+        </w:rPr>
+        <w:lastRenderedPageBreak/>
+        <w:t>đầy đủ tham số trên cơ sở hạ tầng đám mây sẽ mở ra không gian cải thiện đáng kể về chất lượng sinh câu trả lời.</w:t>
       </w:r>
     </w:p>
     <w:p>

</xml_diff>